<commit_message>
feat(docx-template): add numbered section hierarchy and equipment/calculation tables
Co-Authored-By: Claude Sonnet 5 <noreply@anthropic.com>
</commit_message>
<xml_diff>
--- a/packages/docx-template/template/dossier-template.docx
+++ b/packages/docx-template/template/dossier-template.docx
@@ -25,66 +25,268 @@
     </w:p>
     <w:p>
       <w:pPr>
+        <w:pStyle w:val="Heading1"/>
+      </w:pPr>
+      <w:r>
+        <w:t xml:space="preserve">I. Préambule</w:t>
+      </w:r>
+    </w:p>
+    <w:p>
+      <w:r>
+        <w:t xml:space="preserve">Nom : {clientFullName}</w:t>
+      </w:r>
+    </w:p>
+    <w:p>
+      <w:r>
+        <w:t xml:space="preserve">Adresse : {clientAddress}</w:t>
+      </w:r>
+    </w:p>
+    <w:p>
+      <w:r>
+        <w:t xml:space="preserve">Référence STEG : {clientStegReference}</w:t>
+      </w:r>
+    </w:p>
+    <w:p>
+      <w:pPr>
+        <w:pStyle w:val="Heading1"/>
+      </w:pPr>
+      <w:r>
+        <w:t xml:space="preserve">II. Présentation du projet</w:t>
+      </w:r>
+    </w:p>
+    <w:p>
+      <w:r>
+        <w:t xml:space="preserve">{introduction}</w:t>
+      </w:r>
+    </w:p>
+    <w:p>
+      <w:pPr>
+        <w:pStyle w:val="Heading1"/>
+      </w:pPr>
+      <w:r>
+        <w:t xml:space="preserve">III. Description de la solution technique</w:t>
+      </w:r>
+    </w:p>
+    <w:p>
+      <w:r>
+        <w:t xml:space="preserve">{solution}</w:t>
+      </w:r>
+    </w:p>
+    <w:p>
+      <w:pPr>
         <w:pStyle w:val="Heading2"/>
       </w:pPr>
       <w:r>
-        <w:t xml:space="preserve">Client</w:t>
-      </w:r>
-    </w:p>
-    <w:p>
-      <w:r>
-        <w:t xml:space="preserve">Nom : {clientFullName}</w:t>
-      </w:r>
-    </w:p>
-    <w:p>
-      <w:r>
-        <w:t xml:space="preserve">Adresse : {clientAddress}</w:t>
-      </w:r>
-    </w:p>
-    <w:p>
-      <w:r>
-        <w:t xml:space="preserve">Référence STEG : {clientStegReference}</w:t>
-      </w:r>
-    </w:p>
+        <w:t xml:space="preserve">III.1 Caractéristiques du module</w:t>
+      </w:r>
+    </w:p>
+    <w:p>
+      <w:r>
+        <w:t xml:space="preserve">Module : {moduleBrandModel}</w:t>
+      </w:r>
+    </w:p>
+    <w:tbl>
+      <w:tblPr>
+        <w:tblW w:type="pct" w:w="5000"/>
+        <w:tblBorders>
+          <w:top w:val="single" w:color="auto" w:sz="4"/>
+          <w:left w:val="single" w:color="auto" w:sz="4"/>
+          <w:bottom w:val="single" w:color="auto" w:sz="4"/>
+          <w:right w:val="single" w:color="auto" w:sz="4"/>
+          <w:insideH w:val="single" w:color="auto" w:sz="4"/>
+          <w:insideV w:val="single" w:color="auto" w:sz="4"/>
+        </w:tblBorders>
+      </w:tblPr>
+      <w:tblGrid>
+        <w:gridCol w:w="4513"/>
+        <w:gridCol w:w="4513"/>
+      </w:tblGrid>
+      <w:tr>
+        <w:tc>
+          <w:p>
+            <w:r>
+              <w:t xml:space="preserve">Puissance crête (Wc)</w:t>
+            </w:r>
+          </w:p>
+        </w:tc>
+        <w:tc>
+          <w:p>
+            <w:r>
+              <w:t xml:space="preserve">{moduleSpecPmaxW}</w:t>
+            </w:r>
+          </w:p>
+        </w:tc>
+      </w:tr>
+      <w:tr>
+        <w:tc>
+          <w:p>
+            <w:r>
+              <w:t xml:space="preserve">Tension Vmp (V)</w:t>
+            </w:r>
+          </w:p>
+        </w:tc>
+        <w:tc>
+          <w:p>
+            <w:r>
+              <w:t xml:space="preserve">{moduleSpecVmpV}</w:t>
+            </w:r>
+          </w:p>
+        </w:tc>
+      </w:tr>
+      <w:tr>
+        <w:tc>
+          <w:p>
+            <w:r>
+              <w:t xml:space="preserve">Courant Imp (A)</w:t>
+            </w:r>
+          </w:p>
+        </w:tc>
+        <w:tc>
+          <w:p>
+            <w:r>
+              <w:t xml:space="preserve">{moduleSpecImpA}</w:t>
+            </w:r>
+          </w:p>
+        </w:tc>
+      </w:tr>
+      <w:tr>
+        <w:tc>
+          <w:p>
+            <w:r>
+              <w:t xml:space="preserve">Tension Voc (V)</w:t>
+            </w:r>
+          </w:p>
+        </w:tc>
+        <w:tc>
+          <w:p>
+            <w:r>
+              <w:t xml:space="preserve">{moduleSpecVocV}</w:t>
+            </w:r>
+          </w:p>
+        </w:tc>
+      </w:tr>
+      <w:tr>
+        <w:tc>
+          <w:p>
+            <w:r>
+              <w:t xml:space="preserve">Courant Isc (A)</w:t>
+            </w:r>
+          </w:p>
+        </w:tc>
+        <w:tc>
+          <w:p>
+            <w:r>
+              <w:t xml:space="preserve">{moduleSpecIscA}</w:t>
+            </w:r>
+          </w:p>
+        </w:tc>
+      </w:tr>
+    </w:tbl>
     <w:p>
       <w:pPr>
         <w:pStyle w:val="Heading2"/>
       </w:pPr>
       <w:r>
-        <w:t xml:space="preserve">Introduction</w:t>
-      </w:r>
-    </w:p>
-    <w:p>
-      <w:r>
-        <w:t xml:space="preserve">{introduction}</w:t>
-      </w:r>
-    </w:p>
+        <w:t xml:space="preserve">III.2 Caractéristiques de l'onduleur</w:t>
+      </w:r>
+    </w:p>
+    <w:p>
+      <w:r>
+        <w:t xml:space="preserve">Onduleur : {inverterBrandModel}</w:t>
+      </w:r>
+    </w:p>
+    <w:tbl>
+      <w:tblPr>
+        <w:tblW w:type="pct" w:w="5000"/>
+        <w:tblBorders>
+          <w:top w:val="single" w:color="auto" w:sz="4"/>
+          <w:left w:val="single" w:color="auto" w:sz="4"/>
+          <w:bottom w:val="single" w:color="auto" w:sz="4"/>
+          <w:right w:val="single" w:color="auto" w:sz="4"/>
+          <w:insideH w:val="single" w:color="auto" w:sz="4"/>
+          <w:insideV w:val="single" w:color="auto" w:sz="4"/>
+        </w:tblBorders>
+      </w:tblPr>
+      <w:tblGrid>
+        <w:gridCol w:w="4513"/>
+        <w:gridCol w:w="4513"/>
+      </w:tblGrid>
+      <w:tr>
+        <w:tc>
+          <w:p>
+            <w:r>
+              <w:t xml:space="preserve">Puissance AC (W)</w:t>
+            </w:r>
+          </w:p>
+        </w:tc>
+        <w:tc>
+          <w:p>
+            <w:r>
+              <w:t xml:space="preserve">{inverterSpecPacW}</w:t>
+            </w:r>
+          </w:p>
+        </w:tc>
+      </w:tr>
+      <w:tr>
+        <w:tc>
+          <w:p>
+            <w:r>
+              <w:t xml:space="preserve">Tension DC max (V)</w:t>
+            </w:r>
+          </w:p>
+        </w:tc>
+        <w:tc>
+          <w:p>
+            <w:r>
+              <w:t xml:space="preserve">{inverterSpecVdcMaxV}</w:t>
+            </w:r>
+          </w:p>
+        </w:tc>
+      </w:tr>
+      <w:tr>
+        <w:tc>
+          <w:p>
+            <w:r>
+              <w:t xml:space="preserve">Plage MPPT min (V)</w:t>
+            </w:r>
+          </w:p>
+        </w:tc>
+        <w:tc>
+          <w:p>
+            <w:r>
+              <w:t xml:space="preserve">{inverterSpecMpptMinV}</w:t>
+            </w:r>
+          </w:p>
+        </w:tc>
+      </w:tr>
+      <w:tr>
+        <w:tc>
+          <w:p>
+            <w:r>
+              <w:t xml:space="preserve">Plage MPPT max (V)</w:t>
+            </w:r>
+          </w:p>
+        </w:tc>
+        <w:tc>
+          <w:p>
+            <w:r>
+              <w:t xml:space="preserve">{inverterSpecMpptMaxV}</w:t>
+            </w:r>
+          </w:p>
+        </w:tc>
+      </w:tr>
+    </w:tbl>
     <w:p>
       <w:pPr>
         <w:pStyle w:val="Heading2"/>
       </w:pPr>
       <w:r>
-        <w:t xml:space="preserve">Description de la solution</w:t>
-      </w:r>
-    </w:p>
-    <w:p>
-      <w:r>
-        <w:t xml:space="preserve">{solution}</w:t>
-      </w:r>
-    </w:p>
-    <w:p>
-      <w:r>
-        <w:t xml:space="preserve">Module : {moduleBrandModel}</w:t>
-      </w:r>
-    </w:p>
-    <w:p>
-      <w:r>
-        <w:t xml:space="preserve">Onduleur : {inverterBrandModel}</w:t>
-      </w:r>
-    </w:p>
-    <w:p>
-      <w:r>
-        <w:t xml:space="preserve">Puissance DC : {pDcW}</w:t>
+        <w:t xml:space="preserve">III.3 Dimensionnement du champ PV</w:t>
+      </w:r>
+    </w:p>
+    <w:p>
+      <w:r>
+        <w:t xml:space="preserve">Puissance totale : {pDcW}</w:t>
       </w:r>
     </w:p>
     <w:p>
@@ -92,12 +294,109 @@
         <w:t xml:space="preserve">Nombre de modules : {moduleCount}</w:t>
       </w:r>
     </w:p>
+    <w:tbl>
+      <w:tblPr>
+        <w:tblW w:type="pct" w:w="5000"/>
+        <w:tblBorders>
+          <w:top w:val="single" w:color="auto" w:sz="4"/>
+          <w:left w:val="single" w:color="auto" w:sz="4"/>
+          <w:bottom w:val="single" w:color="auto" w:sz="4"/>
+          <w:right w:val="single" w:color="auto" w:sz="4"/>
+          <w:insideH w:val="single" w:color="auto" w:sz="4"/>
+          <w:insideV w:val="single" w:color="auto" w:sz="4"/>
+        </w:tblBorders>
+      </w:tblPr>
+      <w:tblGrid>
+        <w:gridCol w:w="4513"/>
+        <w:gridCol w:w="4513"/>
+      </w:tblGrid>
+      <w:tr>
+        <w:tc>
+          <w:p>
+            <w:r>
+              <w:t xml:space="preserve">Ns min</w:t>
+            </w:r>
+          </w:p>
+        </w:tc>
+        <w:tc>
+          <w:p>
+            <w:r>
+              <w:t xml:space="preserve">{stringSizingNsMin}</w:t>
+            </w:r>
+          </w:p>
+        </w:tc>
+      </w:tr>
+      <w:tr>
+        <w:tc>
+          <w:p>
+            <w:r>
+              <w:t xml:space="preserve">Ns max</w:t>
+            </w:r>
+          </w:p>
+        </w:tc>
+        <w:tc>
+          <w:p>
+            <w:r>
+              <w:t xml:space="preserve">{stringSizingNsMax}</w:t>
+            </w:r>
+          </w:p>
+        </w:tc>
+      </w:tr>
+      <w:tr>
+        <w:tc>
+          <w:p>
+            <w:r>
+              <w:t xml:space="preserve">Ns optimal max</w:t>
+            </w:r>
+          </w:p>
+        </w:tc>
+        <w:tc>
+          <w:p>
+            <w:r>
+              <w:t xml:space="preserve">{stringSizingNsOptMax}</w:t>
+            </w:r>
+          </w:p>
+        </w:tc>
+      </w:tr>
+      <w:tr>
+        <w:tc>
+          <w:p>
+            <w:r>
+              <w:t xml:space="preserve">Np max</w:t>
+            </w:r>
+          </w:p>
+        </w:tc>
+        <w:tc>
+          <w:p>
+            <w:r>
+              <w:t xml:space="preserve">{stringSizingNpMax}</w:t>
+            </w:r>
+          </w:p>
+        </w:tc>
+      </w:tr>
+      <w:tr>
+        <w:tc>
+          <w:p>
+            <w:r>
+              <w:t xml:space="preserve">Np optimal</w:t>
+            </w:r>
+          </w:p>
+        </w:tc>
+        <w:tc>
+          <w:p>
+            <w:r>
+              <w:t xml:space="preserve">{stringSizingNpOpt}</w:t>
+            </w:r>
+          </w:p>
+        </w:tc>
+      </w:tr>
+    </w:tbl>
     <w:p>
       <w:pPr>
         <w:pStyle w:val="Heading2"/>
       </w:pPr>
       <w:r>
-        <w:t xml:space="preserve">Onduleurs et chaînes</w:t>
+        <w:t xml:space="preserve">III.4 Onduleurs et chaînes</w:t>
       </w:r>
     </w:p>
     <w:p>
@@ -181,10 +480,10 @@
     </w:p>
     <w:p>
       <w:pPr>
-        <w:pStyle w:val="Heading2"/>
-      </w:pPr>
-      <w:r>
-        <w:t xml:space="preserve">Câblage</w:t>
+        <w:pStyle w:val="Heading1"/>
+      </w:pPr>
+      <w:r>
+        <w:t xml:space="preserve">IV. Câblage</w:t>
       </w:r>
     </w:p>
     <w:p>
@@ -276,7 +575,96 @@
         <w:pStyle w:val="Heading2"/>
       </w:pPr>
       <w:r>
-        <w:t xml:space="preserve">Mise à la terre</w:t>
+        <w:t xml:space="preserve">IV.1 Chute de tension</w:t>
+      </w:r>
+    </w:p>
+    <w:tbl>
+      <w:tblPr>
+        <w:tblW w:type="pct" w:w="5000"/>
+        <w:tblBorders>
+          <w:top w:val="single" w:color="auto" w:sz="4"/>
+          <w:left w:val="single" w:color="auto" w:sz="4"/>
+          <w:bottom w:val="single" w:color="auto" w:sz="4"/>
+          <w:right w:val="single" w:color="auto" w:sz="4"/>
+          <w:insideH w:val="single" w:color="auto" w:sz="4"/>
+          <w:insideV w:val="single" w:color="auto" w:sz="4"/>
+        </w:tblBorders>
+      </w:tblPr>
+      <w:tblGrid>
+        <w:gridCol w:w="4513"/>
+        <w:gridCol w:w="4513"/>
+      </w:tblGrid>
+      <w:tr>
+        <w:tc>
+          <w:p>
+            <w:r>
+              <w:t xml:space="preserve">Chute de tension DC (V)</w:t>
+            </w:r>
+          </w:p>
+        </w:tc>
+        <w:tc>
+          <w:p>
+            <w:r>
+              <w:t xml:space="preserve">{voltageDropDuDcV}</w:t>
+            </w:r>
+          </w:p>
+        </w:tc>
+      </w:tr>
+      <w:tr>
+        <w:tc>
+          <w:p>
+            <w:r>
+              <w:t xml:space="preserve">Chute de tension DC (%)</w:t>
+            </w:r>
+          </w:p>
+        </w:tc>
+        <w:tc>
+          <w:p>
+            <w:r>
+              <w:t xml:space="preserve">{voltageDropDuDcPct}</w:t>
+            </w:r>
+          </w:p>
+        </w:tc>
+      </w:tr>
+      <w:tr>
+        <w:tc>
+          <w:p>
+            <w:r>
+              <w:t xml:space="preserve">Chute de tension AC (V)</w:t>
+            </w:r>
+          </w:p>
+        </w:tc>
+        <w:tc>
+          <w:p>
+            <w:r>
+              <w:t xml:space="preserve">{voltageDropDuAcV}</w:t>
+            </w:r>
+          </w:p>
+        </w:tc>
+      </w:tr>
+      <w:tr>
+        <w:tc>
+          <w:p>
+            <w:r>
+              <w:t xml:space="preserve">Chute de tension AC (%)</w:t>
+            </w:r>
+          </w:p>
+        </w:tc>
+        <w:tc>
+          <w:p>
+            <w:r>
+              <w:t xml:space="preserve">{voltageDropDuAcPct}</w:t>
+            </w:r>
+          </w:p>
+        </w:tc>
+      </w:tr>
+    </w:tbl>
+    <w:p>
+      <w:pPr>
+        <w:pStyle w:val="Heading1"/>
+      </w:pPr>
+      <w:r>
+        <w:t xml:space="preserve">V. Mise à la terre</w:t>
       </w:r>
     </w:p>
     <w:p>
@@ -286,10 +674,10 @@
     </w:p>
     <w:p>
       <w:pPr>
-        <w:pStyle w:val="Heading2"/>
-      </w:pPr>
-      <w:r>
-        <w:t xml:space="preserve">Structure</w:t>
+        <w:pStyle w:val="Heading1"/>
+      </w:pPr>
+      <w:r>
+        <w:t xml:space="preserve">VI. Structure et lestage</w:t>
       </w:r>
     </w:p>
     <w:p>
@@ -297,6 +685,71 @@
         <w:t xml:space="preserve">{structure}</w:t>
       </w:r>
     </w:p>
+    <w:tbl>
+      <w:tblPr>
+        <w:tblW w:type="pct" w:w="5000"/>
+        <w:tblBorders>
+          <w:top w:val="single" w:color="auto" w:sz="4"/>
+          <w:left w:val="single" w:color="auto" w:sz="4"/>
+          <w:bottom w:val="single" w:color="auto" w:sz="4"/>
+          <w:right w:val="single" w:color="auto" w:sz="4"/>
+          <w:insideH w:val="single" w:color="auto" w:sz="4"/>
+          <w:insideV w:val="single" w:color="auto" w:sz="4"/>
+        </w:tblBorders>
+      </w:tblPr>
+      <w:tblGrid>
+        <w:gridCol w:w="4513"/>
+        <w:gridCol w:w="4513"/>
+      </w:tblGrid>
+      <w:tr>
+        <w:tc>
+          <w:p>
+            <w:r>
+              <w:t xml:space="preserve">Poids total (N)</w:t>
+            </w:r>
+          </w:p>
+        </w:tc>
+        <w:tc>
+          <w:p>
+            <w:r>
+              <w:t xml:space="preserve">{stabilityWeightN}</w:t>
+            </w:r>
+          </w:p>
+        </w:tc>
+      </w:tr>
+      <w:tr>
+        <w:tc>
+          <w:p>
+            <w:r>
+              <w:t xml:space="preserve">Stabilité — membre gauche</w:t>
+            </w:r>
+          </w:p>
+        </w:tc>
+        <w:tc>
+          <w:p>
+            <w:r>
+              <w:t xml:space="preserve">{stabilityLhs}</w:t>
+            </w:r>
+          </w:p>
+        </w:tc>
+      </w:tr>
+      <w:tr>
+        <w:tc>
+          <w:p>
+            <w:r>
+              <w:t xml:space="preserve">Stabilité — membre droit</w:t>
+            </w:r>
+          </w:p>
+        </w:tc>
+        <w:tc>
+          <w:p>
+            <w:r>
+              <w:t xml:space="preserve">{stabilityRhs}</w:t>
+            </w:r>
+          </w:p>
+        </w:tc>
+      </w:tr>
+    </w:tbl>
     <w:p>
       <w:r>
         <w:t xml:space="preserve">{#dcFuseRequired}</w:t>
@@ -304,10 +757,10 @@
     </w:p>
     <w:p>
       <w:pPr>
-        <w:pStyle w:val="Heading2"/>
-      </w:pPr>
-      <w:r>
-        <w:t xml:space="preserve">Protection DC — fusible</w:t>
+        <w:pStyle w:val="Heading1"/>
+      </w:pPr>
+      <w:r>
+        <w:t xml:space="preserve">VII. Protection DC — fusible</w:t>
       </w:r>
     </w:p>
     <w:p>
@@ -327,10 +780,10 @@
     </w:p>
     <w:p>
       <w:pPr>
-        <w:pStyle w:val="Heading2"/>
-      </w:pPr>
-      <w:r>
-        <w:t xml:space="preserve">Protection AC — sectionneur</w:t>
+        <w:pStyle w:val="Heading1"/>
+      </w:pPr>
+      <w:r>
+        <w:t xml:space="preserve">VIII. Protection AC — sectionneur</w:t>
       </w:r>
     </w:p>
     <w:p>
@@ -345,10 +798,10 @@
     </w:p>
     <w:p>
       <w:pPr>
-        <w:pStyle w:val="Heading2"/>
-      </w:pPr>
-      <w:r>
-        <w:t xml:space="preserve">Conclusion</w:t>
+        <w:pStyle w:val="Heading1"/>
+      </w:pPr>
+      <w:r>
+        <w:t xml:space="preserve">IX. Conclusion</w:t>
       </w:r>
     </w:p>
     <w:p>

</xml_diff>

<commit_message>
feat: reduce Structure entry to material + wind speed
Tunisian dossiers need only the material and design wind speed. The
frame count, weight, H, D (and ballast/coefficient/description) inputs
are removed from the form and cleared on save.

- db: frameCount/structureWeightN/heightHM/depthDM become nullable
  (hand-written migration, not yet applied against a database)
- engine: wind-stability derivations and check C18 only run when all
  stability inputs are present; a non-default wind speed no longer
  blocks generation without them
- docx-template: stability table wrapped in {#stabilityComputed}
- dossier-worker/web: map optional stability inputs, adapt summaries

Co-Authored-By: Claude Sonnet 5.5 <noreply@anthropic.com>
</commit_message>
<xml_diff>
--- a/packages/docx-template/template/dossier-template.docx
+++ b/packages/docx-template/template/dossier-template.docx
@@ -661,6 +661,11 @@
         <w:t xml:space="preserve">{structure}</w:t>
       </w:r>
     </w:p>
+    <w:p>
+      <w:r>
+        <w:t xml:space="preserve">{#stabilityComputed}</w:t>
+      </w:r>
+    </w:p>
     <w:tbl>
       <w:tblPr>
         <w:tblW w:type="pct" w:w="5000"/>
@@ -726,6 +731,11 @@
         </w:tc>
       </w:tr>
     </w:tbl>
+    <w:p>
+      <w:r>
+        <w:t xml:space="preserve">{/stabilityComputed}</w:t>
+      </w:r>
+    </w:p>
     <w:p>
       <w:r>
         <w:t xml:space="preserve">{#dcFuseRequired}</w:t>

</xml_diff>

<commit_message>
feat(dossier): dimensionnement et productible section from the bill and PVGIS
Co-Authored-By: Claude Sonnet 5.5 <noreply@anthropic.com>
</commit_message>
<xml_diff>
--- a/packages/docx-template/template/dossier-template.docx
+++ b/packages/docx-template/template/dossier-template.docx
@@ -51,6 +51,332 @@
         <w:t xml:space="preserve">{introduction}</w:t>
       </w:r>
     </w:p>
+    <w:p>
+      <w:pPr>
+        <w:pStyle w:val="Heading1"/>
+      </w:pPr>
+      <w:r>
+        <w:t xml:space="preserve">{sectionNumberDimensionnement} Dimensionnement et productible</w:t>
+      </w:r>
+    </w:p>
+    <w:tbl>
+      <w:tblPr>
+        <w:tblW w:type="pct" w:w="5000"/>
+        <w:tblBorders>
+          <w:top w:val="single" w:color="auto" w:sz="4"/>
+          <w:left w:val="single" w:color="auto" w:sz="4"/>
+          <w:bottom w:val="single" w:color="auto" w:sz="4"/>
+          <w:right w:val="single" w:color="auto" w:sz="4"/>
+          <w:insideH w:val="single" w:color="auto" w:sz="4"/>
+          <w:insideV w:val="single" w:color="auto" w:sz="4"/>
+        </w:tblBorders>
+      </w:tblPr>
+      <w:tblGrid>
+        <w:gridCol w:w="4513"/>
+        <w:gridCol w:w="4513"/>
+      </w:tblGrid>
+      <w:tr>
+        <w:tc>
+          <w:p>
+            <w:r>
+              <w:t xml:space="preserve">Type de branchement</w:t>
+            </w:r>
+          </w:p>
+        </w:tc>
+        <w:tc>
+          <w:p>
+            <w:r>
+              <w:t xml:space="preserve">{sizingBranchement}</w:t>
+            </w:r>
+          </w:p>
+        </w:tc>
+      </w:tr>
+      <w:tr>
+        <w:tc>
+          <w:p>
+            <w:r>
+              <w:t xml:space="preserve">Puissance souscrite</w:t>
+            </w:r>
+          </w:p>
+        </w:tc>
+        <w:tc>
+          <w:p>
+            <w:r>
+              <w:t xml:space="preserve">{sizingSubscribedPower}</w:t>
+            </w:r>
+          </w:p>
+        </w:tc>
+      </w:tr>
+      <w:tr>
+        <w:tc>
+          <w:p>
+            <w:r>
+              <w:t xml:space="preserve">Consommation de référence</w:t>
+            </w:r>
+          </w:p>
+        </w:tc>
+        <w:tc>
+          <w:p>
+            <w:r>
+              <w:t xml:space="preserve">{sizingConsumption}</w:t>
+            </w:r>
+          </w:p>
+        </w:tc>
+      </w:tr>
+      <w:tr>
+        <w:tc>
+          <w:p>
+            <w:r>
+              <w:t xml:space="preserve">Puissance crête installée (kWc)</w:t>
+            </w:r>
+          </w:p>
+        </w:tc>
+        <w:tc>
+          <w:p>
+            <w:r>
+              <w:t xml:space="preserve">{sizingInstalledKWp}</w:t>
+            </w:r>
+          </w:p>
+        </w:tc>
+      </w:tr>
+      <w:tr>
+        <w:tc>
+          <w:p>
+            <w:r>
+              <w:t xml:space="preserve">Puissance AC de l'onduleur (kW)</w:t>
+            </w:r>
+          </w:p>
+        </w:tc>
+        <w:tc>
+          <w:p>
+            <w:r>
+              <w:t xml:space="preserve">{sizingInverterPac}</w:t>
+            </w:r>
+          </w:p>
+        </w:tc>
+      </w:tr>
+      <w:tr>
+        <w:tc>
+          <w:p>
+            <w:r>
+              <w:t xml:space="preserve">Rapport DC/AC</w:t>
+            </w:r>
+          </w:p>
+        </w:tc>
+        <w:tc>
+          <w:p>
+            <w:r>
+              <w:t xml:space="preserve">{sizingDcAcRatio}</w:t>
+            </w:r>
+          </w:p>
+        </w:tc>
+      </w:tr>
+      <w:tr>
+        <w:tc>
+          <w:p>
+            <w:r>
+              <w:t xml:space="preserve">Règle de dimensionnement</w:t>
+            </w:r>
+          </w:p>
+        </w:tc>
+        <w:tc>
+          <w:p>
+            <w:r>
+              <w:t xml:space="preserve">{sizingRule}</w:t>
+            </w:r>
+          </w:p>
+        </w:tc>
+      </w:tr>
+      <w:tr>
+        <w:tc>
+          <w:p>
+            <w:r>
+              <w:t xml:space="preserve">Production annuelle estimée (kWh/an)</w:t>
+            </w:r>
+          </w:p>
+        </w:tc>
+        <w:tc>
+          <w:p>
+            <w:r>
+              <w:t xml:space="preserve">{productionAnnual}</w:t>
+            </w:r>
+          </w:p>
+        </w:tc>
+      </w:tr>
+      <w:tr>
+        <w:tc>
+          <w:p>
+            <w:r>
+              <w:t xml:space="preserve">Productible spécifique (kWh/kWc/an)</w:t>
+            </w:r>
+          </w:p>
+        </w:tc>
+        <w:tc>
+          <w:p>
+            <w:r>
+              <w:t xml:space="preserve">{productionSpecificYield}</w:t>
+            </w:r>
+          </w:p>
+        </w:tc>
+      </w:tr>
+      <w:tr>
+        <w:tc>
+          <w:p>
+            <w:r>
+              <w:t xml:space="preserve">Indice de performance (PR)</w:t>
+            </w:r>
+          </w:p>
+        </w:tc>
+        <w:tc>
+          <w:p>
+            <w:r>
+              <w:t xml:space="preserve">{productionPr}</w:t>
+            </w:r>
+          </w:p>
+        </w:tc>
+      </w:tr>
+      <w:tr>
+        <w:tc>
+          <w:p>
+            <w:r>
+              <w:t xml:space="preserve">Taux de couverture de la consommation</w:t>
+            </w:r>
+          </w:p>
+        </w:tc>
+        <w:tc>
+          <w:p>
+            <w:r>
+              <w:t xml:space="preserve">{productionCoverage}</w:t>
+            </w:r>
+          </w:p>
+        </w:tc>
+      </w:tr>
+      <w:tr>
+        <w:tc>
+          <w:p>
+            <w:r>
+              <w:t xml:space="preserve">Méthode</w:t>
+            </w:r>
+          </w:p>
+        </w:tc>
+        <w:tc>
+          <w:p>
+            <w:r>
+              <w:t xml:space="preserve">{productionMethod}</w:t>
+            </w:r>
+          </w:p>
+        </w:tc>
+      </w:tr>
+    </w:tbl>
+    <w:tbl>
+      <w:tblPr>
+        <w:tblW w:type="pct" w:w="5000"/>
+        <w:tblBorders>
+          <w:top w:val="single" w:color="auto" w:sz="4"/>
+          <w:left w:val="single" w:color="auto" w:sz="4"/>
+          <w:bottom w:val="single" w:color="auto" w:sz="4"/>
+          <w:right w:val="single" w:color="auto" w:sz="4"/>
+          <w:insideH w:val="single" w:color="auto" w:sz="4"/>
+          <w:insideV w:val="single" w:color="auto" w:sz="4"/>
+        </w:tblBorders>
+      </w:tblPr>
+      <w:tblGrid>
+        <w:gridCol w:w="2257"/>
+        <w:gridCol w:w="2257"/>
+        <w:gridCol w:w="2257"/>
+        <w:gridCol w:w="2257"/>
+      </w:tblGrid>
+      <w:tr>
+        <w:tc>
+          <w:p>
+            <w:r>
+              <w:t xml:space="preserve">Mois</w:t>
+            </w:r>
+          </w:p>
+        </w:tc>
+        <w:tc>
+          <w:p>
+            <w:r>
+              <w:t xml:space="preserve">Irradiation dans le plan (kWh/m²)</w:t>
+            </w:r>
+          </w:p>
+        </w:tc>
+        <w:tc>
+          <w:p>
+            <w:r>
+              <w:t xml:space="preserve">Production (kWh)</w:t>
+            </w:r>
+          </w:p>
+        </w:tc>
+        <w:tc>
+          <w:p>
+            <w:r>
+              <w:t xml:space="preserve">PR (%)</w:t>
+            </w:r>
+          </w:p>
+        </w:tc>
+      </w:tr>
+      <w:tr>
+        <w:tc>
+          <w:p>
+            <w:r>
+              <w:t xml:space="preserve">{#productionMonths}{monthLabel}</w:t>
+            </w:r>
+          </w:p>
+        </w:tc>
+        <w:tc>
+          <w:p>
+            <w:r>
+              <w:t xml:space="preserve">{globInc}</w:t>
+            </w:r>
+          </w:p>
+        </w:tc>
+        <w:tc>
+          <w:p>
+            <w:r>
+              <w:t xml:space="preserve">{eGrid}</w:t>
+            </w:r>
+          </w:p>
+        </w:tc>
+        <w:tc>
+          <w:p>
+            <w:r>
+              <w:t xml:space="preserve">{pr}{/productionMonths}</w:t>
+            </w:r>
+          </w:p>
+        </w:tc>
+      </w:tr>
+      <w:tr>
+        <w:tc>
+          <w:p>
+            <w:r>
+              <w:t xml:space="preserve">Total</w:t>
+            </w:r>
+          </w:p>
+        </w:tc>
+        <w:tc>
+          <w:p>
+            <w:r>
+              <w:t xml:space="preserve">{productionTotalGlobInc}</w:t>
+            </w:r>
+          </w:p>
+        </w:tc>
+        <w:tc>
+          <w:p>
+            <w:r>
+              <w:t xml:space="preserve">{productionTotalEGrid}</w:t>
+            </w:r>
+          </w:p>
+        </w:tc>
+        <w:tc>
+          <w:p>
+            <w:r>
+              <w:t xml:space="preserve"/>
+            </w:r>
+          </w:p>
+        </w:tc>
+      </w:tr>
+    </w:tbl>
     <w:p>
       <w:pPr>
         <w:pStyle w:val="Heading1"/>

</xml_diff>

<commit_message>
feat: house or flat, explained roof level and earthing details
Co-Authored-By: Claude Sonnet 5.5 <noreply@anthropic.com>
</commit_message>
<xml_diff>
--- a/packages/docx-template/template/dossier-template.docx
+++ b/packages/docx-template/template/dossier-template.docx
@@ -79,6 +79,11 @@
     <w:p>
       <w:r>
         <w:t xml:space="preserve">{introduction}</w:t>
+      </w:r>
+    </w:p>
+    <w:p>
+      <w:r>
+        <w:t xml:space="preserve">{siteBuildingLine}</w:t>
       </w:r>
     </w:p>
     <w:p>
@@ -1004,6 +1009,55 @@
         <w:t xml:space="preserve">{earthing}</w:t>
       </w:r>
     </w:p>
+    <w:tbl>
+      <w:tblPr>
+        <w:tblW w:type="pct" w:w="5000"/>
+        <w:tblBorders>
+          <w:top w:val="single" w:color="auto" w:sz="4"/>
+          <w:left w:val="single" w:color="auto" w:sz="4"/>
+          <w:bottom w:val="single" w:color="auto" w:sz="4"/>
+          <w:right w:val="single" w:color="auto" w:sz="4"/>
+          <w:insideH w:val="single" w:color="auto" w:sz="4"/>
+          <w:insideV w:val="single" w:color="auto" w:sz="4"/>
+        </w:tblBorders>
+      </w:tblPr>
+      <w:tblGrid>
+        <w:gridCol w:w="4513"/>
+        <w:gridCol w:w="4513"/>
+      </w:tblGrid>
+      <w:tr>
+        <w:tc>
+          <w:p>
+            <w:r>
+              <w:t xml:space="preserve">Désignation</w:t>
+            </w:r>
+          </w:p>
+        </w:tc>
+        <w:tc>
+          <w:p>
+            <w:r>
+              <w:t xml:space="preserve">Valeur</w:t>
+            </w:r>
+          </w:p>
+        </w:tc>
+      </w:tr>
+      <w:tr>
+        <w:tc>
+          <w:p>
+            <w:r>
+              <w:t xml:space="preserve">{#earthingDetails}{label}</w:t>
+            </w:r>
+          </w:p>
+        </w:tc>
+        <w:tc>
+          <w:p>
+            <w:r>
+              <w:t xml:space="preserve">{value}{/earthingDetails}</w:t>
+            </w:r>
+          </w:p>
+        </w:tc>
+      </w:tr>
+    </w:tbl>
     <w:p>
       <w:pPr>
         <w:pStyle w:val="Heading1"/>

</xml_diff>

<commit_message>
feat: pre-generation summary with STEG pieces; draft dossiers are watermarked
- Saving the locations opens /projects/[id]/summary instead of generating.
- The summary lists the installation, cable lengths and how they were derived,
  STEG pieces done/total with per-piece upload, electrical checks, quota and the
  generate button. Missing pieces make the dossier a draft instead of blocking it.
- Generation is refused while a bill-flow project's points are not saved
  (flowStep PROPOSALS/LOCATIONS); it opens the job page on success.
- A flat's syndic authorization joins annex N°1 after the STEG contract.
- The worker stamps "BROUILLON – NON RECEVABLE" on every page of dossier.pdf and
  inserts the missing-pieces page after the cover; annexes.pdf stays untouched.
  The Word body carries the same notice under its title.

Co-Authored-By: Claude Opus 5.5 <noreply@anthropic.com>
</commit_message>
<xml_diff>
--- a/packages/docx-template/template/dossier-template.docx
+++ b/packages/docx-template/template/dossier-template.docx
@@ -8,6 +8,11 @@
       </w:pPr>
       <w:r>
         <w:t xml:space="preserve">Dossier technique de raccordement d'une installation photovoltaïque au réseau BT de la STEG</w:t>
+      </w:r>
+    </w:p>
+    <w:p>
+      <w:r>
+        <w:t xml:space="preserve">{#isDraft}BROUILLON – NON RECEVABLE. Pièces manquantes : {draftMissingText}{/isDraft}</w:t>
       </w:r>
     </w:p>
     <w:p>

</xml_diff>

<commit_message>
feat(dossier): reference-style typography, tables, header, footer and page frame
- Word template: Times New Roman 11 pt, black bold headings (13 pt / 11 pt underlined), no blue
  theme colour; tables in the reference style (amber header row, salmon label column, single 4
  borders) with computed values in blue. Style helpers (valueRun, anLabel, conclusionRun,
  styledTable) live in scripts/template-styles.ts for the later template tasks.
- pdf-lib fragments (TOC, drawings, plans, annex divider, draft page) use the Times faces.
- stampStudyPages frames the cover, TOC and body, adds the running header (installer logo or
  name, dossier number, STEG logo) and « Page n sur N » on pages 2..N; it runs before the
  draft watermark and shifts its numbers by the inserted page so they match the TOC.
- The TOC starts below the stamped header.

Co-Authored-By: Claude Opus 5.5 <noreply@anthropic.com>
</commit_message>
<xml_diff>
--- a/packages/docx-template/template/dossier-template.docx
+++ b/packages/docx-template/template/dossier-template.docx
@@ -103,22 +103,32 @@
       <w:tblPr>
         <w:tblW w:type="pct" w:w="5000"/>
         <w:tblBorders>
-          <w:top w:val="single" w:color="auto" w:sz="4"/>
-          <w:left w:val="single" w:color="auto" w:sz="4"/>
-          <w:bottom w:val="single" w:color="auto" w:sz="4"/>
-          <w:right w:val="single" w:color="auto" w:sz="4"/>
-          <w:insideH w:val="single" w:color="auto" w:sz="4"/>
-          <w:insideV w:val="single" w:color="auto" w:sz="4"/>
+          <w:top w:val="single" w:color="000000" w:sz="4"/>
+          <w:left w:val="single" w:color="000000" w:sz="4"/>
+          <w:bottom w:val="single" w:color="000000" w:sz="4"/>
+          <w:right w:val="single" w:color="000000" w:sz="4"/>
+          <w:insideH w:val="single" w:color="000000" w:sz="4"/>
+          <w:insideV w:val="single" w:color="000000" w:sz="4"/>
         </w:tblBorders>
       </w:tblPr>
       <w:tblGrid>
-        <w:gridCol w:w="4513"/>
-        <w:gridCol w:w="4513"/>
+        <w:gridCol w:w="4535"/>
+        <w:gridCol w:w="4535"/>
       </w:tblGrid>
       <w:tr>
-        <w:tc>
-          <w:p>
-            <w:r>
+        <w:trPr>
+          <w:tblHeader w:val="off"/>
+        </w:trPr>
+        <w:tc>
+          <w:tcPr>
+            <w:shd w:fill="FBE4D5" w:color="auto" w:val="clear"/>
+          </w:tcPr>
+          <w:p>
+            <w:r>
+              <w:rPr>
+                <w:b w:val="false"/>
+                <w:bCs w:val="false"/>
+              </w:rPr>
               <w:t xml:space="preserve">Type de branchement</w:t>
             </w:r>
           </w:p>
@@ -126,15 +136,28 @@
         <w:tc>
           <w:p>
             <w:r>
+              <w:rPr>
+                <w:color w:val="1F4E9A"/>
+              </w:rPr>
               <w:t xml:space="preserve">{sizingBranchement}</w:t>
             </w:r>
           </w:p>
         </w:tc>
       </w:tr>
       <w:tr>
-        <w:tc>
-          <w:p>
-            <w:r>
+        <w:trPr>
+          <w:tblHeader w:val="off"/>
+        </w:trPr>
+        <w:tc>
+          <w:tcPr>
+            <w:shd w:fill="FBE4D5" w:color="auto" w:val="clear"/>
+          </w:tcPr>
+          <w:p>
+            <w:r>
+              <w:rPr>
+                <w:b w:val="false"/>
+                <w:bCs w:val="false"/>
+              </w:rPr>
               <w:t xml:space="preserve">Puissance souscrite</w:t>
             </w:r>
           </w:p>
@@ -142,15 +165,28 @@
         <w:tc>
           <w:p>
             <w:r>
+              <w:rPr>
+                <w:color w:val="1F4E9A"/>
+              </w:rPr>
               <w:t xml:space="preserve">{sizingSubscribedPower}</w:t>
             </w:r>
           </w:p>
         </w:tc>
       </w:tr>
       <w:tr>
-        <w:tc>
-          <w:p>
-            <w:r>
+        <w:trPr>
+          <w:tblHeader w:val="off"/>
+        </w:trPr>
+        <w:tc>
+          <w:tcPr>
+            <w:shd w:fill="FBE4D5" w:color="auto" w:val="clear"/>
+          </w:tcPr>
+          <w:p>
+            <w:r>
+              <w:rPr>
+                <w:b w:val="false"/>
+                <w:bCs w:val="false"/>
+              </w:rPr>
               <w:t xml:space="preserve">Consommation de référence</w:t>
             </w:r>
           </w:p>
@@ -158,15 +194,28 @@
         <w:tc>
           <w:p>
             <w:r>
+              <w:rPr>
+                <w:color w:val="1F4E9A"/>
+              </w:rPr>
               <w:t xml:space="preserve">{sizingConsumption}</w:t>
             </w:r>
           </w:p>
         </w:tc>
       </w:tr>
       <w:tr>
-        <w:tc>
-          <w:p>
-            <w:r>
+        <w:trPr>
+          <w:tblHeader w:val="off"/>
+        </w:trPr>
+        <w:tc>
+          <w:tcPr>
+            <w:shd w:fill="FBE4D5" w:color="auto" w:val="clear"/>
+          </w:tcPr>
+          <w:p>
+            <w:r>
+              <w:rPr>
+                <w:b w:val="false"/>
+                <w:bCs w:val="false"/>
+              </w:rPr>
               <w:t xml:space="preserve">Puissance crête installée (kWc)</w:t>
             </w:r>
           </w:p>
@@ -174,15 +223,28 @@
         <w:tc>
           <w:p>
             <w:r>
+              <w:rPr>
+                <w:color w:val="1F4E9A"/>
+              </w:rPr>
               <w:t xml:space="preserve">{sizingInstalledKWp}</w:t>
             </w:r>
           </w:p>
         </w:tc>
       </w:tr>
       <w:tr>
-        <w:tc>
-          <w:p>
-            <w:r>
+        <w:trPr>
+          <w:tblHeader w:val="off"/>
+        </w:trPr>
+        <w:tc>
+          <w:tcPr>
+            <w:shd w:fill="FBE4D5" w:color="auto" w:val="clear"/>
+          </w:tcPr>
+          <w:p>
+            <w:r>
+              <w:rPr>
+                <w:b w:val="false"/>
+                <w:bCs w:val="false"/>
+              </w:rPr>
               <w:t xml:space="preserve">Puissance AC de l'onduleur (kW)</w:t>
             </w:r>
           </w:p>
@@ -190,15 +252,28 @@
         <w:tc>
           <w:p>
             <w:r>
+              <w:rPr>
+                <w:color w:val="1F4E9A"/>
+              </w:rPr>
               <w:t xml:space="preserve">{sizingInverterPac}</w:t>
             </w:r>
           </w:p>
         </w:tc>
       </w:tr>
       <w:tr>
-        <w:tc>
-          <w:p>
-            <w:r>
+        <w:trPr>
+          <w:tblHeader w:val="off"/>
+        </w:trPr>
+        <w:tc>
+          <w:tcPr>
+            <w:shd w:fill="FBE4D5" w:color="auto" w:val="clear"/>
+          </w:tcPr>
+          <w:p>
+            <w:r>
+              <w:rPr>
+                <w:b w:val="false"/>
+                <w:bCs w:val="false"/>
+              </w:rPr>
               <w:t xml:space="preserve">Rapport DC/AC</w:t>
             </w:r>
           </w:p>
@@ -206,15 +281,28 @@
         <w:tc>
           <w:p>
             <w:r>
+              <w:rPr>
+                <w:color w:val="1F4E9A"/>
+              </w:rPr>
               <w:t xml:space="preserve">{sizingDcAcRatio}</w:t>
             </w:r>
           </w:p>
         </w:tc>
       </w:tr>
       <w:tr>
-        <w:tc>
-          <w:p>
-            <w:r>
+        <w:trPr>
+          <w:tblHeader w:val="off"/>
+        </w:trPr>
+        <w:tc>
+          <w:tcPr>
+            <w:shd w:fill="FBE4D5" w:color="auto" w:val="clear"/>
+          </w:tcPr>
+          <w:p>
+            <w:r>
+              <w:rPr>
+                <w:b w:val="false"/>
+                <w:bCs w:val="false"/>
+              </w:rPr>
               <w:t xml:space="preserve">Règle de dimensionnement</w:t>
             </w:r>
           </w:p>
@@ -222,15 +310,28 @@
         <w:tc>
           <w:p>
             <w:r>
+              <w:rPr>
+                <w:color w:val="1F4E9A"/>
+              </w:rPr>
               <w:t xml:space="preserve">{sizingRule}</w:t>
             </w:r>
           </w:p>
         </w:tc>
       </w:tr>
       <w:tr>
-        <w:tc>
-          <w:p>
-            <w:r>
+        <w:trPr>
+          <w:tblHeader w:val="off"/>
+        </w:trPr>
+        <w:tc>
+          <w:tcPr>
+            <w:shd w:fill="FBE4D5" w:color="auto" w:val="clear"/>
+          </w:tcPr>
+          <w:p>
+            <w:r>
+              <w:rPr>
+                <w:b w:val="false"/>
+                <w:bCs w:val="false"/>
+              </w:rPr>
               <w:t xml:space="preserve">Production annuelle estimée (kWh/an)</w:t>
             </w:r>
           </w:p>
@@ -238,15 +339,28 @@
         <w:tc>
           <w:p>
             <w:r>
+              <w:rPr>
+                <w:color w:val="1F4E9A"/>
+              </w:rPr>
               <w:t xml:space="preserve">{productionAnnual}</w:t>
             </w:r>
           </w:p>
         </w:tc>
       </w:tr>
       <w:tr>
-        <w:tc>
-          <w:p>
-            <w:r>
+        <w:trPr>
+          <w:tblHeader w:val="off"/>
+        </w:trPr>
+        <w:tc>
+          <w:tcPr>
+            <w:shd w:fill="FBE4D5" w:color="auto" w:val="clear"/>
+          </w:tcPr>
+          <w:p>
+            <w:r>
+              <w:rPr>
+                <w:b w:val="false"/>
+                <w:bCs w:val="false"/>
+              </w:rPr>
               <w:t xml:space="preserve">Productible spécifique (kWh/kWc/an)</w:t>
             </w:r>
           </w:p>
@@ -254,15 +368,28 @@
         <w:tc>
           <w:p>
             <w:r>
+              <w:rPr>
+                <w:color w:val="1F4E9A"/>
+              </w:rPr>
               <w:t xml:space="preserve">{productionSpecificYield}</w:t>
             </w:r>
           </w:p>
         </w:tc>
       </w:tr>
       <w:tr>
-        <w:tc>
-          <w:p>
-            <w:r>
+        <w:trPr>
+          <w:tblHeader w:val="off"/>
+        </w:trPr>
+        <w:tc>
+          <w:tcPr>
+            <w:shd w:fill="FBE4D5" w:color="auto" w:val="clear"/>
+          </w:tcPr>
+          <w:p>
+            <w:r>
+              <w:rPr>
+                <w:b w:val="false"/>
+                <w:bCs w:val="false"/>
+              </w:rPr>
               <w:t xml:space="preserve">Indice de performance (PR)</w:t>
             </w:r>
           </w:p>
@@ -270,15 +397,28 @@
         <w:tc>
           <w:p>
             <w:r>
+              <w:rPr>
+                <w:color w:val="1F4E9A"/>
+              </w:rPr>
               <w:t xml:space="preserve">{productionPr}</w:t>
             </w:r>
           </w:p>
         </w:tc>
       </w:tr>
       <w:tr>
-        <w:tc>
-          <w:p>
-            <w:r>
+        <w:trPr>
+          <w:tblHeader w:val="off"/>
+        </w:trPr>
+        <w:tc>
+          <w:tcPr>
+            <w:shd w:fill="FBE4D5" w:color="auto" w:val="clear"/>
+          </w:tcPr>
+          <w:p>
+            <w:r>
+              <w:rPr>
+                <w:b w:val="false"/>
+                <w:bCs w:val="false"/>
+              </w:rPr>
               <w:t xml:space="preserve">Taux de couverture de la consommation</w:t>
             </w:r>
           </w:p>
@@ -286,15 +426,28 @@
         <w:tc>
           <w:p>
             <w:r>
+              <w:rPr>
+                <w:color w:val="1F4E9A"/>
+              </w:rPr>
               <w:t xml:space="preserve">{productionCoverage}</w:t>
             </w:r>
           </w:p>
         </w:tc>
       </w:tr>
       <w:tr>
-        <w:tc>
-          <w:p>
-            <w:r>
+        <w:trPr>
+          <w:tblHeader w:val="off"/>
+        </w:trPr>
+        <w:tc>
+          <w:tcPr>
+            <w:shd w:fill="FBE4D5" w:color="auto" w:val="clear"/>
+          </w:tcPr>
+          <w:p>
+            <w:r>
+              <w:rPr>
+                <w:b w:val="false"/>
+                <w:bCs w:val="false"/>
+              </w:rPr>
               <w:t xml:space="preserve">Méthode</w:t>
             </w:r>
           </w:p>
@@ -302,6 +455,9 @@
         <w:tc>
           <w:p>
             <w:r>
+              <w:rPr>
+                <w:color w:val="1F4E9A"/>
+              </w:rPr>
               <w:t xml:space="preserve">{productionMethod}</w:t>
             </w:r>
           </w:p>
@@ -312,54 +468,95 @@
       <w:tblPr>
         <w:tblW w:type="pct" w:w="5000"/>
         <w:tblBorders>
-          <w:top w:val="single" w:color="auto" w:sz="4"/>
-          <w:left w:val="single" w:color="auto" w:sz="4"/>
-          <w:bottom w:val="single" w:color="auto" w:sz="4"/>
-          <w:right w:val="single" w:color="auto" w:sz="4"/>
-          <w:insideH w:val="single" w:color="auto" w:sz="4"/>
-          <w:insideV w:val="single" w:color="auto" w:sz="4"/>
+          <w:top w:val="single" w:color="000000" w:sz="4"/>
+          <w:left w:val="single" w:color="000000" w:sz="4"/>
+          <w:bottom w:val="single" w:color="000000" w:sz="4"/>
+          <w:right w:val="single" w:color="000000" w:sz="4"/>
+          <w:insideH w:val="single" w:color="000000" w:sz="4"/>
+          <w:insideV w:val="single" w:color="000000" w:sz="4"/>
         </w:tblBorders>
       </w:tblPr>
       <w:tblGrid>
-        <w:gridCol w:w="2257"/>
-        <w:gridCol w:w="2257"/>
-        <w:gridCol w:w="2257"/>
-        <w:gridCol w:w="2257"/>
+        <w:gridCol w:w="2268"/>
+        <w:gridCol w:w="2268"/>
+        <w:gridCol w:w="2268"/>
+        <w:gridCol w:w="2268"/>
       </w:tblGrid>
       <w:tr>
-        <w:tc>
-          <w:p>
-            <w:r>
+        <w:trPr>
+          <w:tblHeader/>
+        </w:trPr>
+        <w:tc>
+          <w:tcPr>
+            <w:shd w:fill="FFC000" w:color="auto" w:val="clear"/>
+          </w:tcPr>
+          <w:p>
+            <w:r>
+              <w:rPr>
+                <w:b/>
+                <w:bCs/>
+              </w:rPr>
               <w:t xml:space="preserve">Mois</w:t>
             </w:r>
           </w:p>
         </w:tc>
         <w:tc>
-          <w:p>
-            <w:r>
+          <w:tcPr>
+            <w:shd w:fill="FFC000" w:color="auto" w:val="clear"/>
+          </w:tcPr>
+          <w:p>
+            <w:r>
+              <w:rPr>
+                <w:b/>
+                <w:bCs/>
+              </w:rPr>
               <w:t xml:space="preserve">Irradiation dans le plan (kWh/m²)</w:t>
             </w:r>
           </w:p>
         </w:tc>
         <w:tc>
-          <w:p>
-            <w:r>
+          <w:tcPr>
+            <w:shd w:fill="FFC000" w:color="auto" w:val="clear"/>
+          </w:tcPr>
+          <w:p>
+            <w:r>
+              <w:rPr>
+                <w:b/>
+                <w:bCs/>
+              </w:rPr>
               <w:t xml:space="preserve">Production (kWh)</w:t>
             </w:r>
           </w:p>
         </w:tc>
         <w:tc>
-          <w:p>
-            <w:r>
+          <w:tcPr>
+            <w:shd w:fill="FFC000" w:color="auto" w:val="clear"/>
+          </w:tcPr>
+          <w:p>
+            <w:r>
+              <w:rPr>
+                <w:b/>
+                <w:bCs/>
+              </w:rPr>
               <w:t xml:space="preserve">PR (%)</w:t>
             </w:r>
           </w:p>
         </w:tc>
       </w:tr>
       <w:tr>
-        <w:tc>
-          <w:p>
-            <w:r>
+        <w:trPr>
+          <w:tblHeader w:val="off"/>
+        </w:trPr>
+        <w:tc>
+          <w:tcPr>
+            <w:shd w:fill="FBE4D5" w:color="auto" w:val="clear"/>
+          </w:tcPr>
+          <w:p>
+            <w:r>
+              <w:rPr>
+                <w:b w:val="false"/>
+                <w:bCs w:val="false"/>
+              </w:rPr>
               <w:t xml:space="preserve">{#productionMonths}{monthLabel}</w:t>
             </w:r>
           </w:p>
@@ -367,6 +564,9 @@
         <w:tc>
           <w:p>
             <w:r>
+              <w:rPr>
+                <w:color w:val="1F4E9A"/>
+              </w:rPr>
               <w:t xml:space="preserve">{globInc}</w:t>
             </w:r>
           </w:p>
@@ -374,6 +574,9 @@
         <w:tc>
           <w:p>
             <w:r>
+              <w:rPr>
+                <w:color w:val="1F4E9A"/>
+              </w:rPr>
               <w:t xml:space="preserve">{eGrid}</w:t>
             </w:r>
           </w:p>
@@ -381,15 +584,28 @@
         <w:tc>
           <w:p>
             <w:r>
+              <w:rPr>
+                <w:color w:val="1F4E9A"/>
+              </w:rPr>
               <w:t xml:space="preserve">{pr}{/productionMonths}</w:t>
             </w:r>
           </w:p>
         </w:tc>
       </w:tr>
       <w:tr>
-        <w:tc>
-          <w:p>
-            <w:r>
+        <w:trPr>
+          <w:tblHeader w:val="off"/>
+        </w:trPr>
+        <w:tc>
+          <w:tcPr>
+            <w:shd w:fill="FBE4D5" w:color="auto" w:val="clear"/>
+          </w:tcPr>
+          <w:p>
+            <w:r>
+              <w:rPr>
+                <w:b w:val="false"/>
+                <w:bCs w:val="false"/>
+              </w:rPr>
               <w:t xml:space="preserve">Total</w:t>
             </w:r>
           </w:p>
@@ -397,6 +613,9 @@
         <w:tc>
           <w:p>
             <w:r>
+              <w:rPr>
+                <w:color w:val="1F4E9A"/>
+              </w:rPr>
               <w:t xml:space="preserve">{productionTotalGlobInc}</w:t>
             </w:r>
           </w:p>
@@ -404,6 +623,9 @@
         <w:tc>
           <w:p>
             <w:r>
+              <w:rPr>
+                <w:color w:val="1F4E9A"/>
+              </w:rPr>
               <w:t xml:space="preserve">{productionTotalEGrid}</w:t>
             </w:r>
           </w:p>
@@ -411,6 +633,10 @@
         <w:tc>
           <w:p>
             <w:r>
+              <w:rPr>
+                <w:b w:val="false"/>
+                <w:bCs w:val="false"/>
+              </w:rPr>
               <w:t xml:space="preserve"/>
             </w:r>
           </w:p>
@@ -440,29 +666,45 @@
     </w:p>
     <w:p>
       <w:r>
-        <w:t xml:space="preserve">Module : {moduleBrandModel}</w:t>
+        <w:t xml:space="preserve">Module : </w:t>
+      </w:r>
+      <w:r>
+        <w:rPr>
+          <w:color w:val="1F4E9A"/>
+        </w:rPr>
+        <w:t xml:space="preserve">{moduleBrandModel}</w:t>
       </w:r>
     </w:p>
     <w:tbl>
       <w:tblPr>
         <w:tblW w:type="pct" w:w="5000"/>
         <w:tblBorders>
-          <w:top w:val="single" w:color="auto" w:sz="4"/>
-          <w:left w:val="single" w:color="auto" w:sz="4"/>
-          <w:bottom w:val="single" w:color="auto" w:sz="4"/>
-          <w:right w:val="single" w:color="auto" w:sz="4"/>
-          <w:insideH w:val="single" w:color="auto" w:sz="4"/>
-          <w:insideV w:val="single" w:color="auto" w:sz="4"/>
+          <w:top w:val="single" w:color="000000" w:sz="4"/>
+          <w:left w:val="single" w:color="000000" w:sz="4"/>
+          <w:bottom w:val="single" w:color="000000" w:sz="4"/>
+          <w:right w:val="single" w:color="000000" w:sz="4"/>
+          <w:insideH w:val="single" w:color="000000" w:sz="4"/>
+          <w:insideV w:val="single" w:color="000000" w:sz="4"/>
         </w:tblBorders>
       </w:tblPr>
       <w:tblGrid>
-        <w:gridCol w:w="4513"/>
-        <w:gridCol w:w="4513"/>
+        <w:gridCol w:w="4535"/>
+        <w:gridCol w:w="4535"/>
       </w:tblGrid>
       <w:tr>
-        <w:tc>
-          <w:p>
-            <w:r>
+        <w:trPr>
+          <w:tblHeader w:val="off"/>
+        </w:trPr>
+        <w:tc>
+          <w:tcPr>
+            <w:shd w:fill="FBE4D5" w:color="auto" w:val="clear"/>
+          </w:tcPr>
+          <w:p>
+            <w:r>
+              <w:rPr>
+                <w:b w:val="false"/>
+                <w:bCs w:val="false"/>
+              </w:rPr>
               <w:t xml:space="preserve">Puissance crête (Wc)</w:t>
             </w:r>
           </w:p>
@@ -470,15 +712,28 @@
         <w:tc>
           <w:p>
             <w:r>
+              <w:rPr>
+                <w:color w:val="1F4E9A"/>
+              </w:rPr>
               <w:t xml:space="preserve">{moduleSpecPmaxW}</w:t>
             </w:r>
           </w:p>
         </w:tc>
       </w:tr>
       <w:tr>
-        <w:tc>
-          <w:p>
-            <w:r>
+        <w:trPr>
+          <w:tblHeader w:val="off"/>
+        </w:trPr>
+        <w:tc>
+          <w:tcPr>
+            <w:shd w:fill="FBE4D5" w:color="auto" w:val="clear"/>
+          </w:tcPr>
+          <w:p>
+            <w:r>
+              <w:rPr>
+                <w:b w:val="false"/>
+                <w:bCs w:val="false"/>
+              </w:rPr>
               <w:t xml:space="preserve">Tension Vmp (V)</w:t>
             </w:r>
           </w:p>
@@ -486,15 +741,28 @@
         <w:tc>
           <w:p>
             <w:r>
+              <w:rPr>
+                <w:color w:val="1F4E9A"/>
+              </w:rPr>
               <w:t xml:space="preserve">{moduleSpecVmpV}</w:t>
             </w:r>
           </w:p>
         </w:tc>
       </w:tr>
       <w:tr>
-        <w:tc>
-          <w:p>
-            <w:r>
+        <w:trPr>
+          <w:tblHeader w:val="off"/>
+        </w:trPr>
+        <w:tc>
+          <w:tcPr>
+            <w:shd w:fill="FBE4D5" w:color="auto" w:val="clear"/>
+          </w:tcPr>
+          <w:p>
+            <w:r>
+              <w:rPr>
+                <w:b w:val="false"/>
+                <w:bCs w:val="false"/>
+              </w:rPr>
               <w:t xml:space="preserve">Courant Imp (A)</w:t>
             </w:r>
           </w:p>
@@ -502,15 +770,28 @@
         <w:tc>
           <w:p>
             <w:r>
+              <w:rPr>
+                <w:color w:val="1F4E9A"/>
+              </w:rPr>
               <w:t xml:space="preserve">{moduleSpecImpA}</w:t>
             </w:r>
           </w:p>
         </w:tc>
       </w:tr>
       <w:tr>
-        <w:tc>
-          <w:p>
-            <w:r>
+        <w:trPr>
+          <w:tblHeader w:val="off"/>
+        </w:trPr>
+        <w:tc>
+          <w:tcPr>
+            <w:shd w:fill="FBE4D5" w:color="auto" w:val="clear"/>
+          </w:tcPr>
+          <w:p>
+            <w:r>
+              <w:rPr>
+                <w:b w:val="false"/>
+                <w:bCs w:val="false"/>
+              </w:rPr>
               <w:t xml:space="preserve">Tension Voc (V)</w:t>
             </w:r>
           </w:p>
@@ -518,15 +799,28 @@
         <w:tc>
           <w:p>
             <w:r>
+              <w:rPr>
+                <w:color w:val="1F4E9A"/>
+              </w:rPr>
               <w:t xml:space="preserve">{moduleSpecVocV}</w:t>
             </w:r>
           </w:p>
         </w:tc>
       </w:tr>
       <w:tr>
-        <w:tc>
-          <w:p>
-            <w:r>
+        <w:trPr>
+          <w:tblHeader w:val="off"/>
+        </w:trPr>
+        <w:tc>
+          <w:tcPr>
+            <w:shd w:fill="FBE4D5" w:color="auto" w:val="clear"/>
+          </w:tcPr>
+          <w:p>
+            <w:r>
+              <w:rPr>
+                <w:b w:val="false"/>
+                <w:bCs w:val="false"/>
+              </w:rPr>
               <w:t xml:space="preserve">Courant Isc (A)</w:t>
             </w:r>
           </w:p>
@@ -534,6 +828,9 @@
         <w:tc>
           <w:p>
             <w:r>
+              <w:rPr>
+                <w:color w:val="1F4E9A"/>
+              </w:rPr>
               <w:t xml:space="preserve">{moduleSpecIscA}</w:t>
             </w:r>
           </w:p>
@@ -557,22 +854,32 @@
       <w:tblPr>
         <w:tblW w:type="pct" w:w="5000"/>
         <w:tblBorders>
-          <w:top w:val="single" w:color="auto" w:sz="4"/>
-          <w:left w:val="single" w:color="auto" w:sz="4"/>
-          <w:bottom w:val="single" w:color="auto" w:sz="4"/>
-          <w:right w:val="single" w:color="auto" w:sz="4"/>
-          <w:insideH w:val="single" w:color="auto" w:sz="4"/>
-          <w:insideV w:val="single" w:color="auto" w:sz="4"/>
+          <w:top w:val="single" w:color="000000" w:sz="4"/>
+          <w:left w:val="single" w:color="000000" w:sz="4"/>
+          <w:bottom w:val="single" w:color="000000" w:sz="4"/>
+          <w:right w:val="single" w:color="000000" w:sz="4"/>
+          <w:insideH w:val="single" w:color="000000" w:sz="4"/>
+          <w:insideV w:val="single" w:color="000000" w:sz="4"/>
         </w:tblBorders>
       </w:tblPr>
       <w:tblGrid>
-        <w:gridCol w:w="4513"/>
-        <w:gridCol w:w="4513"/>
+        <w:gridCol w:w="4535"/>
+        <w:gridCol w:w="4535"/>
       </w:tblGrid>
       <w:tr>
-        <w:tc>
-          <w:p>
-            <w:r>
+        <w:trPr>
+          <w:tblHeader w:val="off"/>
+        </w:trPr>
+        <w:tc>
+          <w:tcPr>
+            <w:shd w:fill="FBE4D5" w:color="auto" w:val="clear"/>
+          </w:tcPr>
+          <w:p>
+            <w:r>
+              <w:rPr>
+                <w:b w:val="false"/>
+                <w:bCs w:val="false"/>
+              </w:rPr>
               <w:t xml:space="preserve">Tension DC max (V)</w:t>
             </w:r>
           </w:p>
@@ -580,15 +887,28 @@
         <w:tc>
           <w:p>
             <w:r>
+              <w:rPr>
+                <w:color w:val="1F4E9A"/>
+              </w:rPr>
               <w:t xml:space="preserve">{inverterSpecVdcMaxV}</w:t>
             </w:r>
           </w:p>
         </w:tc>
       </w:tr>
       <w:tr>
-        <w:tc>
-          <w:p>
-            <w:r>
+        <w:trPr>
+          <w:tblHeader w:val="off"/>
+        </w:trPr>
+        <w:tc>
+          <w:tcPr>
+            <w:shd w:fill="FBE4D5" w:color="auto" w:val="clear"/>
+          </w:tcPr>
+          <w:p>
+            <w:r>
+              <w:rPr>
+                <w:b w:val="false"/>
+                <w:bCs w:val="false"/>
+              </w:rPr>
               <w:t xml:space="preserve">Plage MPPT min (V)</w:t>
             </w:r>
           </w:p>
@@ -596,15 +916,28 @@
         <w:tc>
           <w:p>
             <w:r>
+              <w:rPr>
+                <w:color w:val="1F4E9A"/>
+              </w:rPr>
               <w:t xml:space="preserve">{inverterSpecMpptMinV}</w:t>
             </w:r>
           </w:p>
         </w:tc>
       </w:tr>
       <w:tr>
-        <w:tc>
-          <w:p>
-            <w:r>
+        <w:trPr>
+          <w:tblHeader w:val="off"/>
+        </w:trPr>
+        <w:tc>
+          <w:tcPr>
+            <w:shd w:fill="FBE4D5" w:color="auto" w:val="clear"/>
+          </w:tcPr>
+          <w:p>
+            <w:r>
+              <w:rPr>
+                <w:b w:val="false"/>
+                <w:bCs w:val="false"/>
+              </w:rPr>
               <w:t xml:space="preserve">Plage MPPT max (V)</w:t>
             </w:r>
           </w:p>
@@ -612,6 +945,9 @@
         <w:tc>
           <w:p>
             <w:r>
+              <w:rPr>
+                <w:color w:val="1F4E9A"/>
+              </w:rPr>
               <w:t xml:space="preserve">{inverterSpecMpptMaxV}</w:t>
             </w:r>
           </w:p>
@@ -628,34 +964,56 @@
     </w:p>
     <w:p>
       <w:r>
-        <w:t xml:space="preserve">Puissance totale : {pDcW}</w:t>
-      </w:r>
-    </w:p>
-    <w:p>
-      <w:r>
-        <w:t xml:space="preserve">Nombre de modules : {moduleCount}</w:t>
+        <w:t xml:space="preserve">Puissance totale : </w:t>
+      </w:r>
+      <w:r>
+        <w:rPr>
+          <w:color w:val="1F4E9A"/>
+        </w:rPr>
+        <w:t xml:space="preserve">{pDcW}</w:t>
+      </w:r>
+    </w:p>
+    <w:p>
+      <w:r>
+        <w:t xml:space="preserve">Nombre de modules : </w:t>
+      </w:r>
+      <w:r>
+        <w:rPr>
+          <w:color w:val="1F4E9A"/>
+        </w:rPr>
+        <w:t xml:space="preserve">{moduleCount}</w:t>
       </w:r>
     </w:p>
     <w:tbl>
       <w:tblPr>
         <w:tblW w:type="pct" w:w="5000"/>
         <w:tblBorders>
-          <w:top w:val="single" w:color="auto" w:sz="4"/>
-          <w:left w:val="single" w:color="auto" w:sz="4"/>
-          <w:bottom w:val="single" w:color="auto" w:sz="4"/>
-          <w:right w:val="single" w:color="auto" w:sz="4"/>
-          <w:insideH w:val="single" w:color="auto" w:sz="4"/>
-          <w:insideV w:val="single" w:color="auto" w:sz="4"/>
+          <w:top w:val="single" w:color="000000" w:sz="4"/>
+          <w:left w:val="single" w:color="000000" w:sz="4"/>
+          <w:bottom w:val="single" w:color="000000" w:sz="4"/>
+          <w:right w:val="single" w:color="000000" w:sz="4"/>
+          <w:insideH w:val="single" w:color="000000" w:sz="4"/>
+          <w:insideV w:val="single" w:color="000000" w:sz="4"/>
         </w:tblBorders>
       </w:tblPr>
       <w:tblGrid>
-        <w:gridCol w:w="4513"/>
-        <w:gridCol w:w="4513"/>
+        <w:gridCol w:w="4535"/>
+        <w:gridCol w:w="4535"/>
       </w:tblGrid>
       <w:tr>
-        <w:tc>
-          <w:p>
-            <w:r>
+        <w:trPr>
+          <w:tblHeader w:val="off"/>
+        </w:trPr>
+        <w:tc>
+          <w:tcPr>
+            <w:shd w:fill="FBE4D5" w:color="auto" w:val="clear"/>
+          </w:tcPr>
+          <w:p>
+            <w:r>
+              <w:rPr>
+                <w:b w:val="false"/>
+                <w:bCs w:val="false"/>
+              </w:rPr>
               <w:t xml:space="preserve">Ns min</w:t>
             </w:r>
           </w:p>
@@ -663,15 +1021,28 @@
         <w:tc>
           <w:p>
             <w:r>
+              <w:rPr>
+                <w:color w:val="1F4E9A"/>
+              </w:rPr>
               <w:t xml:space="preserve">{stringSizingNsMin}</w:t>
             </w:r>
           </w:p>
         </w:tc>
       </w:tr>
       <w:tr>
-        <w:tc>
-          <w:p>
-            <w:r>
+        <w:trPr>
+          <w:tblHeader w:val="off"/>
+        </w:trPr>
+        <w:tc>
+          <w:tcPr>
+            <w:shd w:fill="FBE4D5" w:color="auto" w:val="clear"/>
+          </w:tcPr>
+          <w:p>
+            <w:r>
+              <w:rPr>
+                <w:b w:val="false"/>
+                <w:bCs w:val="false"/>
+              </w:rPr>
               <w:t xml:space="preserve">Ns max</w:t>
             </w:r>
           </w:p>
@@ -679,15 +1050,28 @@
         <w:tc>
           <w:p>
             <w:r>
+              <w:rPr>
+                <w:color w:val="1F4E9A"/>
+              </w:rPr>
               <w:t xml:space="preserve">{stringSizingNsMax}</w:t>
             </w:r>
           </w:p>
         </w:tc>
       </w:tr>
       <w:tr>
-        <w:tc>
-          <w:p>
-            <w:r>
+        <w:trPr>
+          <w:tblHeader w:val="off"/>
+        </w:trPr>
+        <w:tc>
+          <w:tcPr>
+            <w:shd w:fill="FBE4D5" w:color="auto" w:val="clear"/>
+          </w:tcPr>
+          <w:p>
+            <w:r>
+              <w:rPr>
+                <w:b w:val="false"/>
+                <w:bCs w:val="false"/>
+              </w:rPr>
               <w:t xml:space="preserve">Ns optimal max</w:t>
             </w:r>
           </w:p>
@@ -695,15 +1079,28 @@
         <w:tc>
           <w:p>
             <w:r>
+              <w:rPr>
+                <w:color w:val="1F4E9A"/>
+              </w:rPr>
               <w:t xml:space="preserve">{stringSizingNsOptMax}</w:t>
             </w:r>
           </w:p>
         </w:tc>
       </w:tr>
       <w:tr>
-        <w:tc>
-          <w:p>
-            <w:r>
+        <w:trPr>
+          <w:tblHeader w:val="off"/>
+        </w:trPr>
+        <w:tc>
+          <w:tcPr>
+            <w:shd w:fill="FBE4D5" w:color="auto" w:val="clear"/>
+          </w:tcPr>
+          <w:p>
+            <w:r>
+              <w:rPr>
+                <w:b w:val="false"/>
+                <w:bCs w:val="false"/>
+              </w:rPr>
               <w:t xml:space="preserve">Np max</w:t>
             </w:r>
           </w:p>
@@ -711,15 +1108,28 @@
         <w:tc>
           <w:p>
             <w:r>
+              <w:rPr>
+                <w:color w:val="1F4E9A"/>
+              </w:rPr>
               <w:t xml:space="preserve">{stringSizingNpMax}</w:t>
             </w:r>
           </w:p>
         </w:tc>
       </w:tr>
       <w:tr>
-        <w:tc>
-          <w:p>
-            <w:r>
+        <w:trPr>
+          <w:tblHeader w:val="off"/>
+        </w:trPr>
+        <w:tc>
+          <w:tcPr>
+            <w:shd w:fill="FBE4D5" w:color="auto" w:val="clear"/>
+          </w:tcPr>
+          <w:p>
+            <w:r>
+              <w:rPr>
+                <w:b w:val="false"/>
+                <w:bCs w:val="false"/>
+              </w:rPr>
               <w:t xml:space="preserve">Np optimal</w:t>
             </w:r>
           </w:p>
@@ -727,6 +1137,9 @@
         <w:tc>
           <w:p>
             <w:r>
+              <w:rPr>
+                <w:color w:val="1F4E9A"/>
+              </w:rPr>
               <w:t xml:space="preserve">{stringSizingNpOpt}</w:t>
             </w:r>
           </w:p>
@@ -755,46 +1168,80 @@
       <w:tblPr>
         <w:tblW w:type="pct" w:w="5000"/>
         <w:tblBorders>
-          <w:top w:val="single" w:color="auto" w:sz="4"/>
-          <w:left w:val="single" w:color="auto" w:sz="4"/>
-          <w:bottom w:val="single" w:color="auto" w:sz="4"/>
-          <w:right w:val="single" w:color="auto" w:sz="4"/>
-          <w:insideH w:val="single" w:color="auto" w:sz="4"/>
-          <w:insideV w:val="single" w:color="auto" w:sz="4"/>
+          <w:top w:val="single" w:color="000000" w:sz="4"/>
+          <w:left w:val="single" w:color="000000" w:sz="4"/>
+          <w:bottom w:val="single" w:color="000000" w:sz="4"/>
+          <w:right w:val="single" w:color="000000" w:sz="4"/>
+          <w:insideH w:val="single" w:color="000000" w:sz="4"/>
+          <w:insideV w:val="single" w:color="000000" w:sz="4"/>
         </w:tblBorders>
       </w:tblPr>
       <w:tblGrid>
-        <w:gridCol w:w="3009"/>
-        <w:gridCol w:w="3009"/>
-        <w:gridCol w:w="3009"/>
+        <w:gridCol w:w="3023"/>
+        <w:gridCol w:w="3023"/>
+        <w:gridCol w:w="3023"/>
       </w:tblGrid>
       <w:tr>
-        <w:tc>
-          <w:p>
-            <w:r>
+        <w:trPr>
+          <w:tblHeader/>
+        </w:trPr>
+        <w:tc>
+          <w:tcPr>
+            <w:shd w:fill="FFC000" w:color="auto" w:val="clear"/>
+          </w:tcPr>
+          <w:p>
+            <w:r>
+              <w:rPr>
+                <w:b/>
+                <w:bCs/>
+              </w:rPr>
               <w:t xml:space="preserve">MPPT</w:t>
             </w:r>
           </w:p>
         </w:tc>
         <w:tc>
-          <w:p>
-            <w:r>
+          <w:tcPr>
+            <w:shd w:fill="FFC000" w:color="auto" w:val="clear"/>
+          </w:tcPr>
+          <w:p>
+            <w:r>
+              <w:rPr>
+                <w:b/>
+                <w:bCs/>
+              </w:rPr>
               <w:t xml:space="preserve">Chaînes en parallèle</w:t>
             </w:r>
           </w:p>
         </w:tc>
         <w:tc>
-          <w:p>
-            <w:r>
+          <w:tcPr>
+            <w:shd w:fill="FFC000" w:color="auto" w:val="clear"/>
+          </w:tcPr>
+          <w:p>
+            <w:r>
+              <w:rPr>
+                <w:b/>
+                <w:bCs/>
+              </w:rPr>
               <w:t xml:space="preserve">Modules par chaîne</w:t>
             </w:r>
           </w:p>
         </w:tc>
       </w:tr>
       <w:tr>
-        <w:tc>
-          <w:p>
-            <w:r>
+        <w:trPr>
+          <w:tblHeader w:val="off"/>
+        </w:trPr>
+        <w:tc>
+          <w:tcPr>
+            <w:shd w:fill="FBE4D5" w:color="auto" w:val="clear"/>
+          </w:tcPr>
+          <w:p>
+            <w:r>
+              <w:rPr>
+                <w:b w:val="false"/>
+                <w:bCs w:val="false"/>
+              </w:rPr>
               <w:t xml:space="preserve">{#mppts}{mpptLabel}</w:t>
             </w:r>
           </w:p>
@@ -802,6 +1249,9 @@
         <w:tc>
           <w:p>
             <w:r>
+              <w:rPr>
+                <w:color w:val="1F4E9A"/>
+              </w:rPr>
               <w:t xml:space="preserve">{stringsInParallel}</w:t>
             </w:r>
           </w:p>
@@ -809,6 +1259,9 @@
         <w:tc>
           <w:p>
             <w:r>
+              <w:rPr>
+                <w:color w:val="1F4E9A"/>
+              </w:rPr>
               <w:t xml:space="preserve">{modulesPerString}{/mppts}</w:t>
             </w:r>
           </w:p>
@@ -837,54 +1290,95 @@
       <w:tblPr>
         <w:tblW w:type="pct" w:w="5000"/>
         <w:tblBorders>
-          <w:top w:val="single" w:color="auto" w:sz="4"/>
-          <w:left w:val="single" w:color="auto" w:sz="4"/>
-          <w:bottom w:val="single" w:color="auto" w:sz="4"/>
-          <w:right w:val="single" w:color="auto" w:sz="4"/>
-          <w:insideH w:val="single" w:color="auto" w:sz="4"/>
-          <w:insideV w:val="single" w:color="auto" w:sz="4"/>
+          <w:top w:val="single" w:color="000000" w:sz="4"/>
+          <w:left w:val="single" w:color="000000" w:sz="4"/>
+          <w:bottom w:val="single" w:color="000000" w:sz="4"/>
+          <w:right w:val="single" w:color="000000" w:sz="4"/>
+          <w:insideH w:val="single" w:color="000000" w:sz="4"/>
+          <w:insideV w:val="single" w:color="000000" w:sz="4"/>
         </w:tblBorders>
       </w:tblPr>
       <w:tblGrid>
-        <w:gridCol w:w="2257"/>
-        <w:gridCol w:w="2257"/>
-        <w:gridCol w:w="2257"/>
-        <w:gridCol w:w="2257"/>
+        <w:gridCol w:w="2268"/>
+        <w:gridCol w:w="2268"/>
+        <w:gridCol w:w="2268"/>
+        <w:gridCol w:w="2268"/>
       </w:tblGrid>
       <w:tr>
-        <w:tc>
-          <w:p>
-            <w:r>
+        <w:trPr>
+          <w:tblHeader/>
+        </w:trPr>
+        <w:tc>
+          <w:tcPr>
+            <w:shd w:fill="FFC000" w:color="auto" w:val="clear"/>
+          </w:tcPr>
+          <w:p>
+            <w:r>
+              <w:rPr>
+                <w:b/>
+                <w:bCs/>
+              </w:rPr>
               <w:t xml:space="preserve">Repère</w:t>
             </w:r>
           </w:p>
         </w:tc>
         <w:tc>
-          <w:p>
-            <w:r>
+          <w:tcPr>
+            <w:shd w:fill="FFC000" w:color="auto" w:val="clear"/>
+          </w:tcPr>
+          <w:p>
+            <w:r>
+              <w:rPr>
+                <w:b/>
+                <w:bCs/>
+              </w:rPr>
               <w:t xml:space="preserve">Section (mm²)</w:t>
             </w:r>
           </w:p>
         </w:tc>
         <w:tc>
-          <w:p>
-            <w:r>
+          <w:tcPr>
+            <w:shd w:fill="FFC000" w:color="auto" w:val="clear"/>
+          </w:tcPr>
+          <w:p>
+            <w:r>
+              <w:rPr>
+                <w:b/>
+                <w:bCs/>
+              </w:rPr>
               <w:t xml:space="preserve">Longueur (m)</w:t>
             </w:r>
           </w:p>
         </w:tc>
         <w:tc>
-          <w:p>
-            <w:r>
+          <w:tcPr>
+            <w:shd w:fill="FFC000" w:color="auto" w:val="clear"/>
+          </w:tcPr>
+          <w:p>
+            <w:r>
+              <w:rPr>
+                <w:b/>
+                <w:bCs/>
+              </w:rPr>
               <w:t xml:space="preserve">Mode de pose</w:t>
             </w:r>
           </w:p>
         </w:tc>
       </w:tr>
       <w:tr>
-        <w:tc>
-          <w:p>
-            <w:r>
+        <w:trPr>
+          <w:tblHeader w:val="off"/>
+        </w:trPr>
+        <w:tc>
+          <w:tcPr>
+            <w:shd w:fill="FBE4D5" w:color="auto" w:val="clear"/>
+          </w:tcPr>
+          <w:p>
+            <w:r>
+              <w:rPr>
+                <w:b w:val="false"/>
+                <w:bCs w:val="false"/>
+              </w:rPr>
               <w:t xml:space="preserve">{#cableRuns}{label}</w:t>
             </w:r>
           </w:p>
@@ -892,6 +1386,9 @@
         <w:tc>
           <w:p>
             <w:r>
+              <w:rPr>
+                <w:color w:val="1F4E9A"/>
+              </w:rPr>
               <w:t xml:space="preserve">{sectionMm2}</w:t>
             </w:r>
           </w:p>
@@ -899,6 +1396,9 @@
         <w:tc>
           <w:p>
             <w:r>
+              <w:rPr>
+                <w:color w:val="1F4E9A"/>
+              </w:rPr>
               <w:t xml:space="preserve">{lengthM}</w:t>
             </w:r>
           </w:p>
@@ -906,6 +1406,9 @@
         <w:tc>
           <w:p>
             <w:r>
+              <w:rPr>
+                <w:color w:val="1F4E9A"/>
+              </w:rPr>
               <w:t xml:space="preserve">{installMethod}{/cableRuns}</w:t>
             </w:r>
           </w:p>
@@ -924,22 +1427,32 @@
       <w:tblPr>
         <w:tblW w:type="pct" w:w="5000"/>
         <w:tblBorders>
-          <w:top w:val="single" w:color="auto" w:sz="4"/>
-          <w:left w:val="single" w:color="auto" w:sz="4"/>
-          <w:bottom w:val="single" w:color="auto" w:sz="4"/>
-          <w:right w:val="single" w:color="auto" w:sz="4"/>
-          <w:insideH w:val="single" w:color="auto" w:sz="4"/>
-          <w:insideV w:val="single" w:color="auto" w:sz="4"/>
+          <w:top w:val="single" w:color="000000" w:sz="4"/>
+          <w:left w:val="single" w:color="000000" w:sz="4"/>
+          <w:bottom w:val="single" w:color="000000" w:sz="4"/>
+          <w:right w:val="single" w:color="000000" w:sz="4"/>
+          <w:insideH w:val="single" w:color="000000" w:sz="4"/>
+          <w:insideV w:val="single" w:color="000000" w:sz="4"/>
         </w:tblBorders>
       </w:tblPr>
       <w:tblGrid>
-        <w:gridCol w:w="4513"/>
-        <w:gridCol w:w="4513"/>
+        <w:gridCol w:w="4535"/>
+        <w:gridCol w:w="4535"/>
       </w:tblGrid>
       <w:tr>
-        <w:tc>
-          <w:p>
-            <w:r>
+        <w:trPr>
+          <w:tblHeader w:val="off"/>
+        </w:trPr>
+        <w:tc>
+          <w:tcPr>
+            <w:shd w:fill="FBE4D5" w:color="auto" w:val="clear"/>
+          </w:tcPr>
+          <w:p>
+            <w:r>
+              <w:rPr>
+                <w:b w:val="false"/>
+                <w:bCs w:val="false"/>
+              </w:rPr>
               <w:t xml:space="preserve">Chute de tension DC (V)</w:t>
             </w:r>
           </w:p>
@@ -947,15 +1460,28 @@
         <w:tc>
           <w:p>
             <w:r>
+              <w:rPr>
+                <w:color w:val="1F4E9A"/>
+              </w:rPr>
               <w:t xml:space="preserve">{voltageDropDuDcV}</w:t>
             </w:r>
           </w:p>
         </w:tc>
       </w:tr>
       <w:tr>
-        <w:tc>
-          <w:p>
-            <w:r>
+        <w:trPr>
+          <w:tblHeader w:val="off"/>
+        </w:trPr>
+        <w:tc>
+          <w:tcPr>
+            <w:shd w:fill="FBE4D5" w:color="auto" w:val="clear"/>
+          </w:tcPr>
+          <w:p>
+            <w:r>
+              <w:rPr>
+                <w:b w:val="false"/>
+                <w:bCs w:val="false"/>
+              </w:rPr>
               <w:t xml:space="preserve">Chute de tension DC (%)</w:t>
             </w:r>
           </w:p>
@@ -963,15 +1489,28 @@
         <w:tc>
           <w:p>
             <w:r>
+              <w:rPr>
+                <w:color w:val="1F4E9A"/>
+              </w:rPr>
               <w:t xml:space="preserve">{voltageDropDuDcPct}</w:t>
             </w:r>
           </w:p>
         </w:tc>
       </w:tr>
       <w:tr>
-        <w:tc>
-          <w:p>
-            <w:r>
+        <w:trPr>
+          <w:tblHeader w:val="off"/>
+        </w:trPr>
+        <w:tc>
+          <w:tcPr>
+            <w:shd w:fill="FBE4D5" w:color="auto" w:val="clear"/>
+          </w:tcPr>
+          <w:p>
+            <w:r>
+              <w:rPr>
+                <w:b w:val="false"/>
+                <w:bCs w:val="false"/>
+              </w:rPr>
               <w:t xml:space="preserve">Chute de tension AC (V)</w:t>
             </w:r>
           </w:p>
@@ -979,15 +1518,28 @@
         <w:tc>
           <w:p>
             <w:r>
+              <w:rPr>
+                <w:color w:val="1F4E9A"/>
+              </w:rPr>
               <w:t xml:space="preserve">{voltageDropDuAcV}</w:t>
             </w:r>
           </w:p>
         </w:tc>
       </w:tr>
       <w:tr>
-        <w:tc>
-          <w:p>
-            <w:r>
+        <w:trPr>
+          <w:tblHeader w:val="off"/>
+        </w:trPr>
+        <w:tc>
+          <w:tcPr>
+            <w:shd w:fill="FBE4D5" w:color="auto" w:val="clear"/>
+          </w:tcPr>
+          <w:p>
+            <w:r>
+              <w:rPr>
+                <w:b w:val="false"/>
+                <w:bCs w:val="false"/>
+              </w:rPr>
               <w:t xml:space="preserve">Chute de tension AC (%)</w:t>
             </w:r>
           </w:p>
@@ -995,6 +1547,9 @@
         <w:tc>
           <w:p>
             <w:r>
+              <w:rPr>
+                <w:color w:val="1F4E9A"/>
+              </w:rPr>
               <w:t xml:space="preserve">{voltageDropDuAcPct}</w:t>
             </w:r>
           </w:p>
@@ -1018,38 +1573,65 @@
       <w:tblPr>
         <w:tblW w:type="pct" w:w="5000"/>
         <w:tblBorders>
-          <w:top w:val="single" w:color="auto" w:sz="4"/>
-          <w:left w:val="single" w:color="auto" w:sz="4"/>
-          <w:bottom w:val="single" w:color="auto" w:sz="4"/>
-          <w:right w:val="single" w:color="auto" w:sz="4"/>
-          <w:insideH w:val="single" w:color="auto" w:sz="4"/>
-          <w:insideV w:val="single" w:color="auto" w:sz="4"/>
+          <w:top w:val="single" w:color="000000" w:sz="4"/>
+          <w:left w:val="single" w:color="000000" w:sz="4"/>
+          <w:bottom w:val="single" w:color="000000" w:sz="4"/>
+          <w:right w:val="single" w:color="000000" w:sz="4"/>
+          <w:insideH w:val="single" w:color="000000" w:sz="4"/>
+          <w:insideV w:val="single" w:color="000000" w:sz="4"/>
         </w:tblBorders>
       </w:tblPr>
       <w:tblGrid>
-        <w:gridCol w:w="4513"/>
-        <w:gridCol w:w="4513"/>
+        <w:gridCol w:w="4535"/>
+        <w:gridCol w:w="4535"/>
       </w:tblGrid>
       <w:tr>
-        <w:tc>
-          <w:p>
-            <w:r>
+        <w:trPr>
+          <w:tblHeader/>
+        </w:trPr>
+        <w:tc>
+          <w:tcPr>
+            <w:shd w:fill="FFC000" w:color="auto" w:val="clear"/>
+          </w:tcPr>
+          <w:p>
+            <w:r>
+              <w:rPr>
+                <w:b/>
+                <w:bCs/>
+              </w:rPr>
               <w:t xml:space="preserve">Désignation</w:t>
             </w:r>
           </w:p>
         </w:tc>
         <w:tc>
-          <w:p>
-            <w:r>
+          <w:tcPr>
+            <w:shd w:fill="FFC000" w:color="auto" w:val="clear"/>
+          </w:tcPr>
+          <w:p>
+            <w:r>
+              <w:rPr>
+                <w:b/>
+                <w:bCs/>
+              </w:rPr>
               <w:t xml:space="preserve">Valeur</w:t>
             </w:r>
           </w:p>
         </w:tc>
       </w:tr>
       <w:tr>
-        <w:tc>
-          <w:p>
-            <w:r>
+        <w:trPr>
+          <w:tblHeader w:val="off"/>
+        </w:trPr>
+        <w:tc>
+          <w:tcPr>
+            <w:shd w:fill="FBE4D5" w:color="auto" w:val="clear"/>
+          </w:tcPr>
+          <w:p>
+            <w:r>
+              <w:rPr>
+                <w:b w:val="false"/>
+                <w:bCs w:val="false"/>
+              </w:rPr>
               <w:t xml:space="preserve">{#earthingDetails}{label}</w:t>
             </w:r>
           </w:p>
@@ -1057,6 +1639,9 @@
         <w:tc>
           <w:p>
             <w:r>
+              <w:rPr>
+                <w:color w:val="1F4E9A"/>
+              </w:rPr>
               <w:t xml:space="preserve">{value}{/earthingDetails}</w:t>
             </w:r>
           </w:p>
@@ -1085,22 +1670,32 @@
       <w:tblPr>
         <w:tblW w:type="pct" w:w="5000"/>
         <w:tblBorders>
-          <w:top w:val="single" w:color="auto" w:sz="4"/>
-          <w:left w:val="single" w:color="auto" w:sz="4"/>
-          <w:bottom w:val="single" w:color="auto" w:sz="4"/>
-          <w:right w:val="single" w:color="auto" w:sz="4"/>
-          <w:insideH w:val="single" w:color="auto" w:sz="4"/>
-          <w:insideV w:val="single" w:color="auto" w:sz="4"/>
+          <w:top w:val="single" w:color="000000" w:sz="4"/>
+          <w:left w:val="single" w:color="000000" w:sz="4"/>
+          <w:bottom w:val="single" w:color="000000" w:sz="4"/>
+          <w:right w:val="single" w:color="000000" w:sz="4"/>
+          <w:insideH w:val="single" w:color="000000" w:sz="4"/>
+          <w:insideV w:val="single" w:color="000000" w:sz="4"/>
         </w:tblBorders>
       </w:tblPr>
       <w:tblGrid>
-        <w:gridCol w:w="4513"/>
-        <w:gridCol w:w="4513"/>
+        <w:gridCol w:w="4535"/>
+        <w:gridCol w:w="4535"/>
       </w:tblGrid>
       <w:tr>
-        <w:tc>
-          <w:p>
-            <w:r>
+        <w:trPr>
+          <w:tblHeader w:val="off"/>
+        </w:trPr>
+        <w:tc>
+          <w:tcPr>
+            <w:shd w:fill="FBE4D5" w:color="auto" w:val="clear"/>
+          </w:tcPr>
+          <w:p>
+            <w:r>
+              <w:rPr>
+                <w:b w:val="false"/>
+                <w:bCs w:val="false"/>
+              </w:rPr>
               <w:t xml:space="preserve">Poids total (N)</w:t>
             </w:r>
           </w:p>
@@ -1108,15 +1703,28 @@
         <w:tc>
           <w:p>
             <w:r>
+              <w:rPr>
+                <w:color w:val="1F4E9A"/>
+              </w:rPr>
               <w:t xml:space="preserve">{stabilityWeightN}</w:t>
             </w:r>
           </w:p>
         </w:tc>
       </w:tr>
       <w:tr>
-        <w:tc>
-          <w:p>
-            <w:r>
+        <w:trPr>
+          <w:tblHeader w:val="off"/>
+        </w:trPr>
+        <w:tc>
+          <w:tcPr>
+            <w:shd w:fill="FBE4D5" w:color="auto" w:val="clear"/>
+          </w:tcPr>
+          <w:p>
+            <w:r>
+              <w:rPr>
+                <w:b w:val="false"/>
+                <w:bCs w:val="false"/>
+              </w:rPr>
               <w:t xml:space="preserve">Stabilité — membre gauche</w:t>
             </w:r>
           </w:p>
@@ -1124,15 +1732,28 @@
         <w:tc>
           <w:p>
             <w:r>
+              <w:rPr>
+                <w:color w:val="1F4E9A"/>
+              </w:rPr>
               <w:t xml:space="preserve">{stabilityLhs}</w:t>
             </w:r>
           </w:p>
         </w:tc>
       </w:tr>
       <w:tr>
-        <w:tc>
-          <w:p>
-            <w:r>
+        <w:trPr>
+          <w:tblHeader w:val="off"/>
+        </w:trPr>
+        <w:tc>
+          <w:tcPr>
+            <w:shd w:fill="FBE4D5" w:color="auto" w:val="clear"/>
+          </w:tcPr>
+          <w:p>
+            <w:r>
+              <w:rPr>
+                <w:b w:val="false"/>
+                <w:bCs w:val="false"/>
+              </w:rPr>
               <w:t xml:space="preserve">Stabilité — membre droit</w:t>
             </w:r>
           </w:p>
@@ -1140,6 +1761,9 @@
         <w:tc>
           <w:p>
             <w:r>
+              <w:rPr>
+                <w:color w:val="1F4E9A"/>
+              </w:rPr>
               <w:t xml:space="preserve">{stabilityRhs}</w:t>
             </w:r>
           </w:p>
@@ -1228,8 +1852,8 @@
         </w:tblBorders>
       </w:tblPr>
       <w:tblGrid>
-        <w:gridCol w:w="4513"/>
-        <w:gridCol w:w="4513"/>
+        <w:gridCol w:w="4535"/>
+        <w:gridCol w:w="4535"/>
       </w:tblGrid>
       <w:tr>
         <w:tc>
@@ -1326,7 +1950,7 @@
     </w:tbl>
     <w:sectPr>
       <w:pgSz w:w="11906" w:h="16838" w:orient="portrait"/>
-      <w:pgMar w:top="1440" w:right="1440" w:bottom="1440" w:left="1440" w:header="708" w:footer="708" w:gutter="0"/>
+      <w:pgMar w:top="1701" w:right="1418" w:bottom="1418" w:left="1418" w:header="708" w:footer="708" w:gutter="0"/>
       <w:pgNumType/>
       <w:docGrid w:linePitch="360"/>
     </w:sectPr>
@@ -1506,7 +2130,13 @@
 <file path=word/styles.xml><?xml version="1.0" encoding="utf-8"?>
 <w:styles xmlns:mc="http://schemas.openxmlformats.org/markup-compatibility/2006" xmlns:r="http://schemas.openxmlformats.org/officeDocument/2006/relationships" xmlns:w="http://schemas.openxmlformats.org/wordprocessingml/2006/main" xmlns:w14="http://schemas.microsoft.com/office/word/2010/wordml" xmlns:w15="http://schemas.microsoft.com/office/word/2012/wordml" mc:Ignorable="w14 w15">
   <w:docDefaults>
-    <w:rPrDefault/>
+    <w:rPrDefault>
+      <w:rPr>
+        <w:rFonts w:ascii="Times New Roman" w:cs="Times New Roman" w:eastAsia="Times New Roman" w:hAnsi="Times New Roman"/>
+        <w:sz w:val="22"/>
+        <w:szCs w:val="22"/>
+      </w:rPr>
+    </w:rPrDefault>
     <w:pPrDefault/>
   </w:docDefaults>
   <w:style w:type="paragraph" w:styleId="Normal" w:default="1">
@@ -1519,8 +2149,12 @@
     <w:next w:val="Normal"/>
     <w:qFormat/>
     <w:rPr>
-      <w:sz w:val="56"/>
-      <w:szCs w:val="56"/>
+      <w:rFonts w:ascii="Times New Roman" w:cs="Times New Roman" w:eastAsia="Times New Roman" w:hAnsi="Times New Roman"/>
+      <w:b/>
+      <w:bCs/>
+      <w:color w:val="000000"/>
+      <w:sz w:val="32"/>
+      <w:szCs w:val="32"/>
     </w:rPr>
   </w:style>
   <w:style w:type="paragraph" w:styleId="Heading1">
@@ -1528,10 +2162,16 @@
     <w:basedOn w:val="Normal"/>
     <w:next w:val="Normal"/>
     <w:qFormat/>
+    <w:pPr>
+      <w:spacing w:after="120" w:before="240"/>
+    </w:pPr>
     <w:rPr>
-      <w:color w:val="2E74B5"/>
-      <w:sz w:val="32"/>
-      <w:szCs w:val="32"/>
+      <w:rFonts w:ascii="Times New Roman" w:cs="Times New Roman" w:eastAsia="Times New Roman" w:hAnsi="Times New Roman"/>
+      <w:b/>
+      <w:bCs/>
+      <w:color w:val="000000"/>
+      <w:sz w:val="26"/>
+      <w:szCs w:val="26"/>
     </w:rPr>
   </w:style>
   <w:style w:type="paragraph" w:styleId="Heading2">
@@ -1539,10 +2179,17 @@
     <w:basedOn w:val="Normal"/>
     <w:next w:val="Normal"/>
     <w:qFormat/>
+    <w:pPr>
+      <w:spacing w:after="80" w:before="160"/>
+    </w:pPr>
     <w:rPr>
-      <w:color w:val="2E74B5"/>
-      <w:sz w:val="26"/>
-      <w:szCs w:val="26"/>
+      <w:rFonts w:ascii="Times New Roman" w:cs="Times New Roman" w:eastAsia="Times New Roman" w:hAnsi="Times New Roman"/>
+      <w:b/>
+      <w:bCs/>
+      <w:color w:val="000000"/>
+      <w:sz w:val="22"/>
+      <w:szCs w:val="22"/>
+      <w:u w:val="single"/>
     </w:rPr>
   </w:style>
   <w:style w:type="paragraph" w:styleId="Heading3">
@@ -1551,9 +2198,12 @@
     <w:next w:val="Normal"/>
     <w:qFormat/>
     <w:rPr>
-      <w:color w:val="1F4D78"/>
-      <w:sz w:val="24"/>
-      <w:szCs w:val="24"/>
+      <w:rFonts w:ascii="Times New Roman" w:cs="Times New Roman" w:eastAsia="Times New Roman" w:hAnsi="Times New Roman"/>
+      <w:b/>
+      <w:bCs/>
+      <w:color w:val="000000"/>
+      <w:sz w:val="22"/>
+      <w:szCs w:val="22"/>
     </w:rPr>
   </w:style>
   <w:style w:type="paragraph" w:styleId="Heading4">
@@ -1562,9 +2212,12 @@
     <w:next w:val="Normal"/>
     <w:qFormat/>
     <w:rPr>
+      <w:rFonts w:ascii="Times New Roman" w:cs="Times New Roman" w:eastAsia="Times New Roman" w:hAnsi="Times New Roman"/>
       <w:i/>
       <w:iCs/>
-      <w:color w:val="2E74B5"/>
+      <w:color w:val="000000"/>
+      <w:sz w:val="22"/>
+      <w:szCs w:val="22"/>
     </w:rPr>
   </w:style>
   <w:style w:type="paragraph" w:styleId="Heading5">
@@ -1573,7 +2226,10 @@
     <w:next w:val="Normal"/>
     <w:qFormat/>
     <w:rPr>
-      <w:color w:val="2E74B5"/>
+      <w:rFonts w:ascii="Times New Roman" w:cs="Times New Roman" w:eastAsia="Times New Roman" w:hAnsi="Times New Roman"/>
+      <w:color w:val="000000"/>
+      <w:sz w:val="22"/>
+      <w:szCs w:val="22"/>
     </w:rPr>
   </w:style>
   <w:style w:type="paragraph" w:styleId="Heading6">
@@ -1582,7 +2238,10 @@
     <w:next w:val="Normal"/>
     <w:qFormat/>
     <w:rPr>
-      <w:color w:val="1F4D78"/>
+      <w:rFonts w:ascii="Times New Roman" w:cs="Times New Roman" w:eastAsia="Times New Roman" w:hAnsi="Times New Roman"/>
+      <w:color w:val="000000"/>
+      <w:sz w:val="22"/>
+      <w:szCs w:val="22"/>
     </w:rPr>
   </w:style>
   <w:style w:type="paragraph" w:styleId="Strong">
@@ -1606,7 +2265,7 @@
     <w:uiPriority w:val="99"/>
     <w:unhideWhenUsed/>
     <w:rPr>
-      <w:color w:val="0563C1"/>
+      <w:color w:val="000000"/>
       <w:u w:val="single"/>
     </w:rPr>
   </w:style>

</xml_diff>

<commit_message>
feat(dossier): string sizing calculation notes with application numérique
Replaces the bare Ns/Np results table (STEG remark 6) with 13 calculation
notes: Voc(Tmin), Vmp(Tmin), Vmp(Tmax), Isc(Tmax), Ns max, Ns min, Ns
optimal max, Np max, Np optimal, Ns retenu, DC/AC power ratio (C06),
Ncmax and the DC fuse (C08). Formulas are the engine's own, the
application numérique substitutes the project's inputs and each result is
the engine's derived value. Tests evaluate every printed expression and
compare it with the engine on three fixtures.

Sub-section numbers now follow the computed section numeral, and the
root template key `conclusion` becomes `conclusionText` so a note's null
conclusion cannot pick up the dossier conclusion through scope lookup.

Co-Authored-By: Claude Opus 5.5 <noreply@anthropic.com>
</commit_message>
<xml_diff>
--- a/packages/docx-template/template/dossier-template.docx
+++ b/packages/docx-template/template/dossier-template.docx
@@ -661,7 +661,7 @@
         <w:pStyle w:val="Heading2"/>
       </w:pPr>
       <w:r>
-        <w:t xml:space="preserve">III.1 Caractéristiques du module</w:t>
+        <w:t xml:space="preserve">{sectionNumberSolution}1 Caractéristiques du module</w:t>
       </w:r>
     </w:p>
     <w:p>
@@ -842,7 +842,7 @@
         <w:pStyle w:val="Heading2"/>
       </w:pPr>
       <w:r>
-        <w:t xml:space="preserve">III.2 Caractéristiques de l'onduleur</w:t>
+        <w:t xml:space="preserve">{sectionNumberSolution}2 Caractéristiques de l'onduleur</w:t>
       </w:r>
     </w:p>
     <w:p>
@@ -959,199 +959,7 @@
         <w:pStyle w:val="Heading2"/>
       </w:pPr>
       <w:r>
-        <w:t xml:space="preserve">III.3 Dimensionnement du champ PV</w:t>
-      </w:r>
-    </w:p>
-    <w:p>
-      <w:r>
-        <w:t xml:space="preserve">Puissance totale : </w:t>
-      </w:r>
-      <w:r>
-        <w:rPr>
-          <w:color w:val="1F4E9A"/>
-        </w:rPr>
-        <w:t xml:space="preserve">{pDcW}</w:t>
-      </w:r>
-    </w:p>
-    <w:p>
-      <w:r>
-        <w:t xml:space="preserve">Nombre de modules : </w:t>
-      </w:r>
-      <w:r>
-        <w:rPr>
-          <w:color w:val="1F4E9A"/>
-        </w:rPr>
-        <w:t xml:space="preserve">{moduleCount}</w:t>
-      </w:r>
-    </w:p>
-    <w:tbl>
-      <w:tblPr>
-        <w:tblW w:type="pct" w:w="5000"/>
-        <w:tblBorders>
-          <w:top w:val="single" w:color="000000" w:sz="4"/>
-          <w:left w:val="single" w:color="000000" w:sz="4"/>
-          <w:bottom w:val="single" w:color="000000" w:sz="4"/>
-          <w:right w:val="single" w:color="000000" w:sz="4"/>
-          <w:insideH w:val="single" w:color="000000" w:sz="4"/>
-          <w:insideV w:val="single" w:color="000000" w:sz="4"/>
-        </w:tblBorders>
-      </w:tblPr>
-      <w:tblGrid>
-        <w:gridCol w:w="4535"/>
-        <w:gridCol w:w="4535"/>
-      </w:tblGrid>
-      <w:tr>
-        <w:trPr>
-          <w:tblHeader w:val="off"/>
-        </w:trPr>
-        <w:tc>
-          <w:tcPr>
-            <w:shd w:fill="FBE4D5" w:color="auto" w:val="clear"/>
-          </w:tcPr>
-          <w:p>
-            <w:r>
-              <w:rPr>
-                <w:b w:val="false"/>
-                <w:bCs w:val="false"/>
-              </w:rPr>
-              <w:t xml:space="preserve">Ns min</w:t>
-            </w:r>
-          </w:p>
-        </w:tc>
-        <w:tc>
-          <w:p>
-            <w:r>
-              <w:rPr>
-                <w:color w:val="1F4E9A"/>
-              </w:rPr>
-              <w:t xml:space="preserve">{stringSizingNsMin}</w:t>
-            </w:r>
-          </w:p>
-        </w:tc>
-      </w:tr>
-      <w:tr>
-        <w:trPr>
-          <w:tblHeader w:val="off"/>
-        </w:trPr>
-        <w:tc>
-          <w:tcPr>
-            <w:shd w:fill="FBE4D5" w:color="auto" w:val="clear"/>
-          </w:tcPr>
-          <w:p>
-            <w:r>
-              <w:rPr>
-                <w:b w:val="false"/>
-                <w:bCs w:val="false"/>
-              </w:rPr>
-              <w:t xml:space="preserve">Ns max</w:t>
-            </w:r>
-          </w:p>
-        </w:tc>
-        <w:tc>
-          <w:p>
-            <w:r>
-              <w:rPr>
-                <w:color w:val="1F4E9A"/>
-              </w:rPr>
-              <w:t xml:space="preserve">{stringSizingNsMax}</w:t>
-            </w:r>
-          </w:p>
-        </w:tc>
-      </w:tr>
-      <w:tr>
-        <w:trPr>
-          <w:tblHeader w:val="off"/>
-        </w:trPr>
-        <w:tc>
-          <w:tcPr>
-            <w:shd w:fill="FBE4D5" w:color="auto" w:val="clear"/>
-          </w:tcPr>
-          <w:p>
-            <w:r>
-              <w:rPr>
-                <w:b w:val="false"/>
-                <w:bCs w:val="false"/>
-              </w:rPr>
-              <w:t xml:space="preserve">Ns optimal max</w:t>
-            </w:r>
-          </w:p>
-        </w:tc>
-        <w:tc>
-          <w:p>
-            <w:r>
-              <w:rPr>
-                <w:color w:val="1F4E9A"/>
-              </w:rPr>
-              <w:t xml:space="preserve">{stringSizingNsOptMax}</w:t>
-            </w:r>
-          </w:p>
-        </w:tc>
-      </w:tr>
-      <w:tr>
-        <w:trPr>
-          <w:tblHeader w:val="off"/>
-        </w:trPr>
-        <w:tc>
-          <w:tcPr>
-            <w:shd w:fill="FBE4D5" w:color="auto" w:val="clear"/>
-          </w:tcPr>
-          <w:p>
-            <w:r>
-              <w:rPr>
-                <w:b w:val="false"/>
-                <w:bCs w:val="false"/>
-              </w:rPr>
-              <w:t xml:space="preserve">Np max</w:t>
-            </w:r>
-          </w:p>
-        </w:tc>
-        <w:tc>
-          <w:p>
-            <w:r>
-              <w:rPr>
-                <w:color w:val="1F4E9A"/>
-              </w:rPr>
-              <w:t xml:space="preserve">{stringSizingNpMax}</w:t>
-            </w:r>
-          </w:p>
-        </w:tc>
-      </w:tr>
-      <w:tr>
-        <w:trPr>
-          <w:tblHeader w:val="off"/>
-        </w:trPr>
-        <w:tc>
-          <w:tcPr>
-            <w:shd w:fill="FBE4D5" w:color="auto" w:val="clear"/>
-          </w:tcPr>
-          <w:p>
-            <w:r>
-              <w:rPr>
-                <w:b w:val="false"/>
-                <w:bCs w:val="false"/>
-              </w:rPr>
-              <w:t xml:space="preserve">Np optimal</w:t>
-            </w:r>
-          </w:p>
-        </w:tc>
-        <w:tc>
-          <w:p>
-            <w:r>
-              <w:rPr>
-                <w:color w:val="1F4E9A"/>
-              </w:rPr>
-              <w:t xml:space="preserve">{stringSizingNpOpt}</w:t>
-            </w:r>
-          </w:p>
-        </w:tc>
-      </w:tr>
-    </w:tbl>
-    <w:p>
-      <w:pPr>
-        <w:pStyle w:val="Heading2"/>
-      </w:pPr>
-      <w:r>
-        <w:t xml:space="preserve">III.4 Onduleurs et chaînes</w:t>
+        <w:t xml:space="preserve">{sectionNumberSolution}3 Onduleurs et chaînes</w:t>
       </w:r>
     </w:p>
     <w:p>
@@ -1271,6 +1079,126 @@
     <w:p>
       <w:r>
         <w:t xml:space="preserve">{/inverters}</w:t>
+      </w:r>
+    </w:p>
+    <w:p>
+      <w:pPr>
+        <w:pStyle w:val="Heading2"/>
+      </w:pPr>
+      <w:r>
+        <w:t xml:space="preserve">{sectionNumberSolution}4 Dimensionnement du champ PV</w:t>
+      </w:r>
+    </w:p>
+    <w:p>
+      <w:r>
+        <w:t xml:space="preserve">Puissance totale : </w:t>
+      </w:r>
+      <w:r>
+        <w:rPr>
+          <w:color w:val="1F4E9A"/>
+        </w:rPr>
+        <w:t xml:space="preserve">{pDcW}</w:t>
+      </w:r>
+    </w:p>
+    <w:p>
+      <w:r>
+        <w:t xml:space="preserve">Nombre de modules : </w:t>
+      </w:r>
+      <w:r>
+        <w:rPr>
+          <w:color w:val="1F4E9A"/>
+        </w:rPr>
+        <w:t xml:space="preserve">{moduleCount}</w:t>
+      </w:r>
+    </w:p>
+    <w:p>
+      <w:r>
+        <w:t xml:space="preserve">Températures de calcul : </w:t>
+      </w:r>
+      <w:r>
+        <w:rPr>
+          <w:color w:val="1F4E9A"/>
+        </w:rPr>
+        <w:t xml:space="preserve">{temperatureAssumptions}</w:t>
+      </w:r>
+    </w:p>
+    <w:p>
+      <w:r>
+        <w:t xml:space="preserve">{#stringSizingNotes}</w:t>
+      </w:r>
+    </w:p>
+    <w:p>
+      <w:pPr>
+        <w:keepNext/>
+        <w:spacing w:before="200"/>
+      </w:pPr>
+      <w:r>
+        <w:rPr>
+          <w:b/>
+          <w:bCs/>
+        </w:rPr>
+        <w:t xml:space="preserve">{title}</w:t>
+      </w:r>
+    </w:p>
+    <w:p>
+      <w:pPr>
+        <w:keepNext/>
+      </w:pPr>
+      <w:r>
+        <w:t xml:space="preserve">Formule : </w:t>
+      </w:r>
+      <w:r>
+        <w:t xml:space="preserve">{formula}</w:t>
+      </w:r>
+    </w:p>
+    <w:p>
+      <w:pPr>
+        <w:keepNext/>
+      </w:pPr>
+      <w:r>
+        <w:rPr>
+          <w:color w:val="C00000"/>
+          <w:u w:val="single"/>
+        </w:rPr>
+        <w:t xml:space="preserve">Application numérique :</w:t>
+      </w:r>
+      <w:r>
+        <w:t xml:space="preserve"> {application}</w:t>
+      </w:r>
+    </w:p>
+    <w:p>
+      <w:r>
+        <w:t xml:space="preserve">Résultat : </w:t>
+      </w:r>
+      <w:r>
+        <w:rPr>
+          <w:color w:val="1F4E9A"/>
+        </w:rPr>
+        <w:t xml:space="preserve">{result}</w:t>
+      </w:r>
+    </w:p>
+    <w:p>
+      <w:r>
+        <w:t xml:space="preserve">{#conclusion}</w:t>
+      </w:r>
+    </w:p>
+    <w:p>
+      <w:r>
+        <w:rPr>
+          <w:color w:val="C00000"/>
+          <w:u w:val="single"/>
+        </w:rPr>
+        <w:t xml:space="preserve">{conclusion}</w:t>
+      </w:r>
+    </w:p>
+    <w:p>
+      <w:r>
+        <w:t xml:space="preserve">{/conclusion}</w:t>
+      </w:r>
+    </w:p>
+    <w:p>
+      <w:r>
+        <w:t xml:space="preserve">{/stringSizingNotes}</w:t>
       </w:r>
     </w:p>
     <w:p>
@@ -1420,7 +1348,7 @@
         <w:pStyle w:val="Heading2"/>
       </w:pPr>
       <w:r>
-        <w:t xml:space="preserve">IV.1 Chute de tension</w:t>
+        <w:t xml:space="preserve">{sectionNumberCablage}1 Chute de tension</w:t>
       </w:r>
     </w:p>
     <w:tbl>
@@ -1831,7 +1759,7 @@
     </w:p>
     <w:p>
       <w:r>
-        <w:t xml:space="preserve">{conclusion}</w:t>
+        <w:t xml:space="preserve">{conclusionText}</w:t>
       </w:r>
     </w:p>
     <w:p>

</xml_diff>

<commit_message>
feat(dossier): protection sizing notes from the engine checks
New section « Dimensionnement des protections » after the string sizing
notes, in the same layout plus the device fitted: DC switch (C09), DC
surge arrester (C10-C12), differential AC breaker (C13, C24 30 mA type A),
AC surge arrester (C14, C12; Up through the engine's checkC11 and In
>= 5 kA, which the engine only checks on the DC side) and AC
disconnection (C15: one inverter, the differential breaker is the AC
disconnecting device). Requirements, numbers and conformity come from the
engine; tests compare the DC switch numbers with STRING_VOC_TMIN and
ISC_FIELD_DESIGN on four fixtures.

Sections now run up to XI; the TOC is built from one list of body titles
(still one page: 12 entries, 32 rows fit).

Co-Authored-By: Claude Opus 5.5 <noreply@anthropic.com>
</commit_message>
<xml_diff>
--- a/packages/docx-template/template/dossier-template.docx
+++ b/packages/docx-template/template/dossier-template.docx
@@ -1167,6 +1167,9 @@
       </w:r>
     </w:p>
     <w:p>
+      <w:pPr>
+        <w:keepNext w:val="false"/>
+      </w:pPr>
       <w:r>
         <w:t xml:space="preserve">Résultat : </w:t>
       </w:r>
@@ -1199,6 +1202,107 @@
     <w:p>
       <w:r>
         <w:t xml:space="preserve">{/stringSizingNotes}</w:t>
+      </w:r>
+    </w:p>
+    <w:p>
+      <w:pPr>
+        <w:pStyle w:val="Heading1"/>
+      </w:pPr>
+      <w:r>
+        <w:t xml:space="preserve">{sectionNumberProtections} Dimensionnement des protections</w:t>
+      </w:r>
+    </w:p>
+    <w:p>
+      <w:r>
+        <w:t xml:space="preserve">{#protectionNotes}</w:t>
+      </w:r>
+    </w:p>
+    <w:p>
+      <w:pPr>
+        <w:keepNext/>
+        <w:spacing w:before="200"/>
+      </w:pPr>
+      <w:r>
+        <w:rPr>
+          <w:b/>
+          <w:bCs/>
+        </w:rPr>
+        <w:t xml:space="preserve">{title}</w:t>
+      </w:r>
+    </w:p>
+    <w:p>
+      <w:pPr>
+        <w:keepNext/>
+      </w:pPr>
+      <w:r>
+        <w:t xml:space="preserve">Exigences : </w:t>
+      </w:r>
+      <w:r>
+        <w:t xml:space="preserve">{formula}</w:t>
+      </w:r>
+    </w:p>
+    <w:p>
+      <w:pPr>
+        <w:keepNext/>
+      </w:pPr>
+      <w:r>
+        <w:rPr>
+          <w:color w:val="C00000"/>
+          <w:u w:val="single"/>
+        </w:rPr>
+        <w:t xml:space="preserve">Application numérique :</w:t>
+      </w:r>
+      <w:r>
+        <w:t xml:space="preserve"> {application}</w:t>
+      </w:r>
+    </w:p>
+    <w:p>
+      <w:pPr>
+        <w:keepNext/>
+      </w:pPr>
+      <w:r>
+        <w:t xml:space="preserve">Résultat : </w:t>
+      </w:r>
+      <w:r>
+        <w:rPr>
+          <w:color w:val="1F4E9A"/>
+        </w:rPr>
+        <w:t xml:space="preserve">{result}</w:t>
+      </w:r>
+    </w:p>
+    <w:p>
+      <w:r>
+        <w:t xml:space="preserve">Matériel retenu : </w:t>
+      </w:r>
+      <w:r>
+        <w:rPr>
+          <w:color w:val="1F4E9A"/>
+        </w:rPr>
+        <w:t xml:space="preserve">{chosen}</w:t>
+      </w:r>
+    </w:p>
+    <w:p>
+      <w:r>
+        <w:t xml:space="preserve">{#conclusion}</w:t>
+      </w:r>
+    </w:p>
+    <w:p>
+      <w:r>
+        <w:rPr>
+          <w:color w:val="C00000"/>
+          <w:u w:val="single"/>
+        </w:rPr>
+        <w:t xml:space="preserve">{conclusion}</w:t>
+      </w:r>
+    </w:p>
+    <w:p>
+      <w:r>
+        <w:t xml:space="preserve">{/conclusion}</w:t>
+      </w:r>
+    </w:p>
+    <w:p>
+      <w:r>
+        <w:t xml:space="preserve">{/protectionNotes}</w:t>
       </w:r>
     </w:p>
     <w:p>

</xml_diff>

<commit_message>
feat: cable sizing and voltage drop notes with correction factors and inputs
- engine: izCorrectionFactors (K1-K4) split out of izCorrected with a
  bit-identical product; derived DC/AC_RUN_IZ, _K1.._K4, _AMBIENT_C and
  AC_DESIGN_CURRENT; INSTALL_METHOD_LABELS names every K1 install method
- dossier: Iz' = Iz x K1 x K2 x K3 x K4 with the NF C 15-100 tables
  (52C/52G, 52N, 52K, 52O), a per-run table and note (C16 / C13), then
  the voltage drop per run with its inputs, application numerique and
  its own limit (DC 3 %, AC 1 %); replaces the bare drop table
- cable table names the install method (STEG remark 10), fr-FR numbers

Co-Authored-By: Claude Opus 5.5 <noreply@anthropic.com>
</commit_message>
<xml_diff>
--- a/packages/docx-template/template/dossier-template.docx
+++ b/packages/docx-template/template/dossier-template.docx
@@ -1452,7 +1452,86 @@
         <w:pStyle w:val="Heading2"/>
       </w:pPr>
       <w:r>
-        <w:t xml:space="preserve">{sectionNumberCablage}1 Chute de tension</w:t>
+        <w:t xml:space="preserve">{sectionNumberCablage}1 Dimensionnement des câbles</w:t>
+      </w:r>
+    </w:p>
+    <w:p>
+      <w:r>
+        <w:t xml:space="preserve">Le courant admissible des câbles est déterminé selon la norme NF C 15-100 (partie 5-52, courants admissibles) et, pour les câbles DC du champ photovoltaïque, selon le guide UTE C15-712-1. Il tient compte des facteurs de correction liés aux conditions de pose :</w:t>
+      </w:r>
+    </w:p>
+    <w:p>
+      <w:pPr>
+        <w:keepNext/>
+        <w:jc w:val="center"/>
+      </w:pPr>
+      <w:r>
+        <w:rPr>
+          <w:b/>
+          <w:bCs/>
+        </w:rPr>
+        <w:t xml:space="preserve">Iz' = Iz × K1 × K2 × K3 × K4</w:t>
+      </w:r>
+    </w:p>
+    <w:p>
+      <w:pPr>
+        <w:keepNext/>
+      </w:pPr>
+      <w:r>
+        <w:t xml:space="preserve">Avec :</w:t>
+      </w:r>
+    </w:p>
+    <w:p>
+      <w:pPr>
+        <w:ind w:left="360"/>
+      </w:pPr>
+      <w:r>
+        <w:t xml:space="preserve">Iz' : courant admissible du câble dans ses conditions de pose (A) ;</w:t>
+      </w:r>
+    </w:p>
+    <w:p>
+      <w:pPr>
+        <w:ind w:left="360"/>
+      </w:pPr>
+      <w:r>
+        <w:t xml:space="preserve">Iz : courant admissible de référence du câble choisi, donné par le fabricant pour sa méthode de référence (B, C, E ou F) à 30 °C (A) ;</w:t>
+      </w:r>
+    </w:p>
+    <w:p>
+      <w:pPr>
+        <w:ind w:left="360"/>
+      </w:pPr>
+      <w:r>
+        <w:t xml:space="preserve">K1 : facteur de correction lié au mode de pose (NF C 15-100, tableau 52C pour le mode de pose, tableau 52G pour la méthode de référence) ;</w:t>
+      </w:r>
+    </w:p>
+    <w:p>
+      <w:pPr>
+        <w:ind w:left="360"/>
+      </w:pPr>
+      <w:r>
+        <w:t xml:space="preserve">K2 : facteur de correction lié au groupement de circuits jointifs (NF C 15-100, tableau 52N) ;</w:t>
+      </w:r>
+    </w:p>
+    <w:p>
+      <w:pPr>
+        <w:ind w:left="360"/>
+      </w:pPr>
+      <w:r>
+        <w:t xml:space="preserve">K3 : facteur de correction lié à la température ambiante et à la nature de l'isolant (NF C 15-100, tableau 52K) ;</w:t>
+      </w:r>
+    </w:p>
+    <w:p>
+      <w:pPr>
+        <w:ind w:left="360"/>
+      </w:pPr>
+      <w:r>
+        <w:t xml:space="preserve">K4 : facteur de correction lié au nombre de couches de câbles (NF C 15-100, tableau 52O).</w:t>
+      </w:r>
+    </w:p>
+    <w:p>
+      <w:r>
+        <w:t xml:space="preserve">Conditions à vérifier : côté DC, Iz' ≥ 1,25 × Isc × Np, courant de conception du champ (UTE C15-712-1) ; côté AC, Ib ≤ In ≤ Iz', avec Ib le courant d'emploi (Iac max de l'onduleur) et In le calibre du disjoncteur (NF C 15-100).</w:t>
       </w:r>
     </w:p>
     <w:tbl>
@@ -1468,9 +1547,147 @@
         </w:tblBorders>
       </w:tblPr>
       <w:tblGrid>
-        <w:gridCol w:w="4535"/>
-        <w:gridCol w:w="4535"/>
+        <w:gridCol w:w="1008"/>
+        <w:gridCol w:w="1008"/>
+        <w:gridCol w:w="1008"/>
+        <w:gridCol w:w="1008"/>
+        <w:gridCol w:w="1008"/>
+        <w:gridCol w:w="1008"/>
+        <w:gridCol w:w="1008"/>
+        <w:gridCol w:w="1008"/>
+        <w:gridCol w:w="1008"/>
       </w:tblGrid>
+      <w:tr>
+        <w:trPr>
+          <w:tblHeader/>
+        </w:trPr>
+        <w:tc>
+          <w:tcPr>
+            <w:shd w:fill="FFC000" w:color="auto" w:val="clear"/>
+          </w:tcPr>
+          <w:p>
+            <w:r>
+              <w:rPr>
+                <w:b/>
+                <w:bCs/>
+              </w:rPr>
+              <w:t xml:space="preserve">Liaison</w:t>
+            </w:r>
+          </w:p>
+        </w:tc>
+        <w:tc>
+          <w:tcPr>
+            <w:shd w:fill="FFC000" w:color="auto" w:val="clear"/>
+          </w:tcPr>
+          <w:p>
+            <w:r>
+              <w:rPr>
+                <w:b/>
+                <w:bCs/>
+              </w:rPr>
+              <w:t xml:space="preserve">S (mm²)</w:t>
+            </w:r>
+          </w:p>
+        </w:tc>
+        <w:tc>
+          <w:tcPr>
+            <w:shd w:fill="FFC000" w:color="auto" w:val="clear"/>
+          </w:tcPr>
+          <w:p>
+            <w:r>
+              <w:rPr>
+                <w:b/>
+                <w:bCs/>
+              </w:rPr>
+              <w:t xml:space="preserve">Iz (A)</w:t>
+            </w:r>
+          </w:p>
+        </w:tc>
+        <w:tc>
+          <w:tcPr>
+            <w:shd w:fill="FFC000" w:color="auto" w:val="clear"/>
+          </w:tcPr>
+          <w:p>
+            <w:r>
+              <w:rPr>
+                <w:b/>
+                <w:bCs/>
+              </w:rPr>
+              <w:t xml:space="preserve">K1</w:t>
+            </w:r>
+          </w:p>
+        </w:tc>
+        <w:tc>
+          <w:tcPr>
+            <w:shd w:fill="FFC000" w:color="auto" w:val="clear"/>
+          </w:tcPr>
+          <w:p>
+            <w:r>
+              <w:rPr>
+                <w:b/>
+                <w:bCs/>
+              </w:rPr>
+              <w:t xml:space="preserve">K2</w:t>
+            </w:r>
+          </w:p>
+        </w:tc>
+        <w:tc>
+          <w:tcPr>
+            <w:shd w:fill="FFC000" w:color="auto" w:val="clear"/>
+          </w:tcPr>
+          <w:p>
+            <w:r>
+              <w:rPr>
+                <w:b/>
+                <w:bCs/>
+              </w:rPr>
+              <w:t xml:space="preserve">K3</w:t>
+            </w:r>
+          </w:p>
+        </w:tc>
+        <w:tc>
+          <w:tcPr>
+            <w:shd w:fill="FFC000" w:color="auto" w:val="clear"/>
+          </w:tcPr>
+          <w:p>
+            <w:r>
+              <w:rPr>
+                <w:b/>
+                <w:bCs/>
+              </w:rPr>
+              <w:t xml:space="preserve">K4</w:t>
+            </w:r>
+          </w:p>
+        </w:tc>
+        <w:tc>
+          <w:tcPr>
+            <w:shd w:fill="FFC000" w:color="auto" w:val="clear"/>
+          </w:tcPr>
+          <w:p>
+            <w:r>
+              <w:rPr>
+                <w:b/>
+                <w:bCs/>
+              </w:rPr>
+              <w:t xml:space="preserve">Iz' (A)</w:t>
+            </w:r>
+          </w:p>
+        </w:tc>
+        <w:tc>
+          <w:tcPr>
+            <w:shd w:fill="FFC000" w:color="auto" w:val="clear"/>
+          </w:tcPr>
+          <w:p>
+            <w:r>
+              <w:rPr>
+                <w:b/>
+                <w:bCs/>
+              </w:rPr>
+              <w:t xml:space="preserve">Courant de conception (A)</w:t>
+            </w:r>
+          </w:p>
+        </w:tc>
+      </w:tr>
       <w:tr>
         <w:trPr>
           <w:tblHeader w:val="off"/>
@@ -1485,17 +1702,327 @@
                 <w:b w:val="false"/>
                 <w:bCs w:val="false"/>
               </w:rPr>
-              <w:t xml:space="preserve">Chute de tension DC (V)</w:t>
-            </w:r>
-          </w:p>
-        </w:tc>
-        <w:tc>
-          <w:p>
-            <w:r>
-              <w:rPr>
-                <w:color w:val="1F4E9A"/>
-              </w:rPr>
-              <w:t xml:space="preserve">{voltageDropDuDcV}</w:t>
+              <w:t xml:space="preserve">{#cableSizingRows}{link}</w:t>
+            </w:r>
+          </w:p>
+        </w:tc>
+        <w:tc>
+          <w:p>
+            <w:r>
+              <w:rPr>
+                <w:color w:val="1F4E9A"/>
+              </w:rPr>
+              <w:t xml:space="preserve">{sectionMm2}</w:t>
+            </w:r>
+          </w:p>
+        </w:tc>
+        <w:tc>
+          <w:p>
+            <w:r>
+              <w:rPr>
+                <w:color w:val="1F4E9A"/>
+              </w:rPr>
+              <w:t xml:space="preserve">{iz}</w:t>
+            </w:r>
+          </w:p>
+        </w:tc>
+        <w:tc>
+          <w:p>
+            <w:r>
+              <w:rPr>
+                <w:color w:val="1F4E9A"/>
+              </w:rPr>
+              <w:t xml:space="preserve">{k1}</w:t>
+            </w:r>
+          </w:p>
+        </w:tc>
+        <w:tc>
+          <w:p>
+            <w:r>
+              <w:rPr>
+                <w:color w:val="1F4E9A"/>
+              </w:rPr>
+              <w:t xml:space="preserve">{k2}</w:t>
+            </w:r>
+          </w:p>
+        </w:tc>
+        <w:tc>
+          <w:p>
+            <w:r>
+              <w:rPr>
+                <w:color w:val="1F4E9A"/>
+              </w:rPr>
+              <w:t xml:space="preserve">{k3}</w:t>
+            </w:r>
+          </w:p>
+        </w:tc>
+        <w:tc>
+          <w:p>
+            <w:r>
+              <w:rPr>
+                <w:color w:val="1F4E9A"/>
+              </w:rPr>
+              <w:t xml:space="preserve">{k4}</w:t>
+            </w:r>
+          </w:p>
+        </w:tc>
+        <w:tc>
+          <w:p>
+            <w:r>
+              <w:rPr>
+                <w:color w:val="1F4E9A"/>
+              </w:rPr>
+              <w:t xml:space="preserve">{izCorrected}</w:t>
+            </w:r>
+          </w:p>
+        </w:tc>
+        <w:tc>
+          <w:p>
+            <w:r>
+              <w:rPr>
+                <w:color w:val="1F4E9A"/>
+              </w:rPr>
+              <w:t xml:space="preserve">{designCurrent}{/cableSizingRows}</w:t>
+            </w:r>
+          </w:p>
+        </w:tc>
+      </w:tr>
+    </w:tbl>
+    <w:p>
+      <w:r>
+        <w:t xml:space="preserve">{#cableSizingRows}</w:t>
+      </w:r>
+    </w:p>
+    <w:p>
+      <w:pPr>
+        <w:keepNext/>
+        <w:spacing w:before="200"/>
+      </w:pPr>
+      <w:r>
+        <w:rPr>
+          <w:b/>
+          <w:bCs/>
+        </w:rPr>
+        <w:t xml:space="preserve">{link}</w:t>
+      </w:r>
+    </w:p>
+    <w:p>
+      <w:pPr>
+        <w:keepNext/>
+      </w:pPr>
+      <w:r>
+        <w:rPr>
+          <w:color w:val="1F4E9A"/>
+        </w:rPr>
+        <w:t xml:space="preserve">{factorsText}</w:t>
+      </w:r>
+    </w:p>
+    <w:p>
+      <w:pPr>
+        <w:keepNext/>
+      </w:pPr>
+      <w:r>
+        <w:rPr>
+          <w:color w:val="C00000"/>
+          <w:u w:val="single"/>
+        </w:rPr>
+        <w:t xml:space="preserve">Application numérique :</w:t>
+      </w:r>
+      <w:r>
+        <w:t xml:space="preserve"> {application}</w:t>
+      </w:r>
+    </w:p>
+    <w:p>
+      <w:pPr>
+        <w:keepNext/>
+      </w:pPr>
+      <w:r>
+        <w:t xml:space="preserve">Résultat : </w:t>
+      </w:r>
+      <w:r>
+        <w:rPr>
+          <w:color w:val="1F4E9A"/>
+        </w:rPr>
+        <w:t xml:space="preserve">{result}</w:t>
+      </w:r>
+    </w:p>
+    <w:p>
+      <w:r>
+        <w:rPr>
+          <w:color w:val="C00000"/>
+          <w:u w:val="single"/>
+        </w:rPr>
+        <w:t xml:space="preserve">{conclusion}</w:t>
+      </w:r>
+    </w:p>
+    <w:p>
+      <w:r>
+        <w:t xml:space="preserve">{/cableSizingRows}</w:t>
+      </w:r>
+    </w:p>
+    <w:p>
+      <w:pPr>
+        <w:pStyle w:val="Heading2"/>
+      </w:pPr>
+      <w:r>
+        <w:t xml:space="preserve">{sectionNumberCablage}2 Chute de tension</w:t>
+      </w:r>
+    </w:p>
+    <w:p>
+      <w:r>
+        <w:t xml:space="preserve">{voltageDropLimitsText}</w:t>
+      </w:r>
+    </w:p>
+    <w:tbl>
+      <w:tblPr>
+        <w:tblW w:type="pct" w:w="5000"/>
+        <w:tblBorders>
+          <w:top w:val="single" w:color="000000" w:sz="4"/>
+          <w:left w:val="single" w:color="000000" w:sz="4"/>
+          <w:bottom w:val="single" w:color="000000" w:sz="4"/>
+          <w:right w:val="single" w:color="000000" w:sz="4"/>
+          <w:insideH w:val="single" w:color="000000" w:sz="4"/>
+          <w:insideV w:val="single" w:color="000000" w:sz="4"/>
+        </w:tblBorders>
+      </w:tblPr>
+      <w:tblGrid>
+        <w:gridCol w:w="1008"/>
+        <w:gridCol w:w="1008"/>
+        <w:gridCol w:w="1008"/>
+        <w:gridCol w:w="1008"/>
+        <w:gridCol w:w="1008"/>
+        <w:gridCol w:w="1008"/>
+        <w:gridCol w:w="1008"/>
+        <w:gridCol w:w="1008"/>
+        <w:gridCol w:w="1008"/>
+      </w:tblGrid>
+      <w:tr>
+        <w:trPr>
+          <w:tblHeader/>
+        </w:trPr>
+        <w:tc>
+          <w:tcPr>
+            <w:shd w:fill="FFC000" w:color="auto" w:val="clear"/>
+          </w:tcPr>
+          <w:p>
+            <w:r>
+              <w:rPr>
+                <w:b/>
+                <w:bCs/>
+              </w:rPr>
+              <w:t xml:space="preserve">Liaison</w:t>
+            </w:r>
+          </w:p>
+        </w:tc>
+        <w:tc>
+          <w:tcPr>
+            <w:shd w:fill="FFC000" w:color="auto" w:val="clear"/>
+          </w:tcPr>
+          <w:p>
+            <w:r>
+              <w:rPr>
+                <w:b/>
+                <w:bCs/>
+              </w:rPr>
+              <w:t xml:space="preserve">ρ (Ω·mm²/m)</w:t>
+            </w:r>
+          </w:p>
+        </w:tc>
+        <w:tc>
+          <w:tcPr>
+            <w:shd w:fill="FFC000" w:color="auto" w:val="clear"/>
+          </w:tcPr>
+          <w:p>
+            <w:r>
+              <w:rPr>
+                <w:b/>
+                <w:bCs/>
+              </w:rPr>
+              <w:t xml:space="preserve">L (m)</w:t>
+            </w:r>
+          </w:p>
+        </w:tc>
+        <w:tc>
+          <w:tcPr>
+            <w:shd w:fill="FFC000" w:color="auto" w:val="clear"/>
+          </w:tcPr>
+          <w:p>
+            <w:r>
+              <w:rPr>
+                <w:b/>
+                <w:bCs/>
+              </w:rPr>
+              <w:t xml:space="preserve">I (A)</w:t>
+            </w:r>
+          </w:p>
+        </w:tc>
+        <w:tc>
+          <w:tcPr>
+            <w:shd w:fill="FFC000" w:color="auto" w:val="clear"/>
+          </w:tcPr>
+          <w:p>
+            <w:r>
+              <w:rPr>
+                <w:b/>
+                <w:bCs/>
+              </w:rPr>
+              <w:t xml:space="preserve">S (mm²)</w:t>
+            </w:r>
+          </w:p>
+        </w:tc>
+        <w:tc>
+          <w:tcPr>
+            <w:shd w:fill="FFC000" w:color="auto" w:val="clear"/>
+          </w:tcPr>
+          <w:p>
+            <w:r>
+              <w:rPr>
+                <w:b/>
+                <w:bCs/>
+              </w:rPr>
+              <w:t xml:space="preserve">U (V)</w:t>
+            </w:r>
+          </w:p>
+        </w:tc>
+        <w:tc>
+          <w:tcPr>
+            <w:shd w:fill="FFC000" w:color="auto" w:val="clear"/>
+          </w:tcPr>
+          <w:p>
+            <w:r>
+              <w:rPr>
+                <w:b/>
+                <w:bCs/>
+              </w:rPr>
+              <w:t xml:space="preserve">ΔU (V)</w:t>
+            </w:r>
+          </w:p>
+        </w:tc>
+        <w:tc>
+          <w:tcPr>
+            <w:shd w:fill="FFC000" w:color="auto" w:val="clear"/>
+          </w:tcPr>
+          <w:p>
+            <w:r>
+              <w:rPr>
+                <w:b/>
+                <w:bCs/>
+              </w:rPr>
+              <w:t xml:space="preserve">ΔU (%)</w:t>
+            </w:r>
+          </w:p>
+        </w:tc>
+        <w:tc>
+          <w:tcPr>
+            <w:shd w:fill="FFC000" w:color="auto" w:val="clear"/>
+          </w:tcPr>
+          <w:p>
+            <w:r>
+              <w:rPr>
+                <w:b/>
+                <w:bCs/>
+              </w:rPr>
+              <w:t xml:space="preserve">Limite (%)</w:t>
             </w:r>
           </w:p>
         </w:tc>
@@ -1514,80 +2041,164 @@
                 <w:b w:val="false"/>
                 <w:bCs w:val="false"/>
               </w:rPr>
-              <w:t xml:space="preserve">Chute de tension DC (%)</w:t>
-            </w:r>
-          </w:p>
-        </w:tc>
-        <w:tc>
-          <w:p>
-            <w:r>
-              <w:rPr>
-                <w:color w:val="1F4E9A"/>
-              </w:rPr>
-              <w:t xml:space="preserve">{voltageDropDuDcPct}</w:t>
-            </w:r>
-          </w:p>
-        </w:tc>
-      </w:tr>
-      <w:tr>
-        <w:trPr>
-          <w:tblHeader w:val="off"/>
-        </w:trPr>
-        <w:tc>
-          <w:tcPr>
-            <w:shd w:fill="FBE4D5" w:color="auto" w:val="clear"/>
-          </w:tcPr>
-          <w:p>
-            <w:r>
-              <w:rPr>
-                <w:b w:val="false"/>
-                <w:bCs w:val="false"/>
-              </w:rPr>
-              <w:t xml:space="preserve">Chute de tension AC (V)</w:t>
-            </w:r>
-          </w:p>
-        </w:tc>
-        <w:tc>
-          <w:p>
-            <w:r>
-              <w:rPr>
-                <w:color w:val="1F4E9A"/>
-              </w:rPr>
-              <w:t xml:space="preserve">{voltageDropDuAcV}</w:t>
-            </w:r>
-          </w:p>
-        </w:tc>
-      </w:tr>
-      <w:tr>
-        <w:trPr>
-          <w:tblHeader w:val="off"/>
-        </w:trPr>
-        <w:tc>
-          <w:tcPr>
-            <w:shd w:fill="FBE4D5" w:color="auto" w:val="clear"/>
-          </w:tcPr>
-          <w:p>
-            <w:r>
-              <w:rPr>
-                <w:b w:val="false"/>
-                <w:bCs w:val="false"/>
-              </w:rPr>
-              <w:t xml:space="preserve">Chute de tension AC (%)</w:t>
-            </w:r>
-          </w:p>
-        </w:tc>
-        <w:tc>
-          <w:p>
-            <w:r>
-              <w:rPr>
-                <w:color w:val="1F4E9A"/>
-              </w:rPr>
-              <w:t xml:space="preserve">{voltageDropDuAcPct}</w:t>
+              <w:t xml:space="preserve">{#voltageDropRows}{link}</w:t>
+            </w:r>
+          </w:p>
+        </w:tc>
+        <w:tc>
+          <w:p>
+            <w:r>
+              <w:rPr>
+                <w:color w:val="1F4E9A"/>
+              </w:rPr>
+              <w:t xml:space="preserve">{rho}</w:t>
+            </w:r>
+          </w:p>
+        </w:tc>
+        <w:tc>
+          <w:p>
+            <w:r>
+              <w:rPr>
+                <w:color w:val="1F4E9A"/>
+              </w:rPr>
+              <w:t xml:space="preserve">{lengthM}</w:t>
+            </w:r>
+          </w:p>
+        </w:tc>
+        <w:tc>
+          <w:p>
+            <w:r>
+              <w:rPr>
+                <w:color w:val="1F4E9A"/>
+              </w:rPr>
+              <w:t xml:space="preserve">{currentA}</w:t>
+            </w:r>
+          </w:p>
+        </w:tc>
+        <w:tc>
+          <w:p>
+            <w:r>
+              <w:rPr>
+                <w:color w:val="1F4E9A"/>
+              </w:rPr>
+              <w:t xml:space="preserve">{sectionMm2}</w:t>
+            </w:r>
+          </w:p>
+        </w:tc>
+        <w:tc>
+          <w:p>
+            <w:r>
+              <w:rPr>
+                <w:color w:val="1F4E9A"/>
+              </w:rPr>
+              <w:t xml:space="preserve">{voltageV}</w:t>
+            </w:r>
+          </w:p>
+        </w:tc>
+        <w:tc>
+          <w:p>
+            <w:r>
+              <w:rPr>
+                <w:color w:val="1F4E9A"/>
+              </w:rPr>
+              <w:t xml:space="preserve">{dropV}</w:t>
+            </w:r>
+          </w:p>
+        </w:tc>
+        <w:tc>
+          <w:p>
+            <w:r>
+              <w:rPr>
+                <w:color w:val="1F4E9A"/>
+              </w:rPr>
+              <w:t xml:space="preserve">{dropPct}</w:t>
+            </w:r>
+          </w:p>
+        </w:tc>
+        <w:tc>
+          <w:p>
+            <w:r>
+              <w:rPr>
+                <w:color w:val="1F4E9A"/>
+              </w:rPr>
+              <w:t xml:space="preserve">{limitPct}{/voltageDropRows}</w:t>
             </w:r>
           </w:p>
         </w:tc>
       </w:tr>
     </w:tbl>
+    <w:p>
+      <w:r>
+        <w:t xml:space="preserve">{#voltageDropRows}</w:t>
+      </w:r>
+    </w:p>
+    <w:p>
+      <w:pPr>
+        <w:keepNext/>
+        <w:spacing w:before="200"/>
+      </w:pPr>
+      <w:r>
+        <w:rPr>
+          <w:b/>
+          <w:bCs/>
+        </w:rPr>
+        <w:t xml:space="preserve">{link}</w:t>
+      </w:r>
+    </w:p>
+    <w:p>
+      <w:pPr>
+        <w:keepNext/>
+      </w:pPr>
+      <w:r>
+        <w:t xml:space="preserve">Formule : </w:t>
+      </w:r>
+      <w:r>
+        <w:t xml:space="preserve">{formula}</w:t>
+      </w:r>
+    </w:p>
+    <w:p>
+      <w:pPr>
+        <w:keepNext/>
+      </w:pPr>
+      <w:r>
+        <w:rPr>
+          <w:color w:val="C00000"/>
+          <w:u w:val="single"/>
+        </w:rPr>
+        <w:t xml:space="preserve">Application numérique :</w:t>
+      </w:r>
+      <w:r>
+        <w:t xml:space="preserve"> {application}</w:t>
+      </w:r>
+    </w:p>
+    <w:p>
+      <w:pPr>
+        <w:keepNext/>
+      </w:pPr>
+      <w:r>
+        <w:t xml:space="preserve">Résultat : </w:t>
+      </w:r>
+      <w:r>
+        <w:rPr>
+          <w:color w:val="1F4E9A"/>
+        </w:rPr>
+        <w:t xml:space="preserve">{result}</w:t>
+      </w:r>
+    </w:p>
+    <w:p>
+      <w:r>
+        <w:rPr>
+          <w:color w:val="C00000"/>
+          <w:u w:val="single"/>
+        </w:rPr>
+        <w:t xml:space="preserve">{conclusion}</w:t>
+      </w:r>
+    </w:p>
+    <w:p>
+      <w:r>
+        <w:t xml:space="preserve">{/voltageDropRows}</w:t>
+      </w:r>
+    </w:p>
     <w:p>
       <w:pPr>
         <w:pStyle w:val="Heading1"/>

</xml_diff>

<commit_message>
feat(dossier): structure section from project data
Co-Authored-By: Claude Sonnet 5.5 <noreply@anthropic.com>
</commit_message>
<xml_diff>
--- a/packages/docx-template/template/dossier-template.docx
+++ b/packages/docx-template/template/dossier-template.docx
@@ -2302,6 +2302,167 @@
     <w:p>
       <w:r>
         <w:t xml:space="preserve">{structure}</w:t>
+      </w:r>
+    </w:p>
+    <w:tbl>
+      <w:tblPr>
+        <w:tblW w:type="pct" w:w="5000"/>
+        <w:tblBorders>
+          <w:top w:val="single" w:color="000000" w:sz="4"/>
+          <w:left w:val="single" w:color="000000" w:sz="4"/>
+          <w:bottom w:val="single" w:color="000000" w:sz="4"/>
+          <w:right w:val="single" w:color="000000" w:sz="4"/>
+          <w:insideH w:val="single" w:color="000000" w:sz="4"/>
+          <w:insideV w:val="single" w:color="000000" w:sz="4"/>
+        </w:tblBorders>
+      </w:tblPr>
+      <w:tblGrid>
+        <w:gridCol w:w="4535"/>
+        <w:gridCol w:w="4535"/>
+      </w:tblGrid>
+      <w:tr>
+        <w:trPr>
+          <w:tblHeader/>
+        </w:trPr>
+        <w:tc>
+          <w:tcPr>
+            <w:shd w:fill="FFC000" w:color="auto" w:val="clear"/>
+          </w:tcPr>
+          <w:p>
+            <w:r>
+              <w:rPr>
+                <w:b/>
+                <w:bCs/>
+              </w:rPr>
+              <w:t xml:space="preserve">Désignation</w:t>
+            </w:r>
+          </w:p>
+        </w:tc>
+        <w:tc>
+          <w:tcPr>
+            <w:shd w:fill="FFC000" w:color="auto" w:val="clear"/>
+          </w:tcPr>
+          <w:p>
+            <w:r>
+              <w:rPr>
+                <w:b/>
+                <w:bCs/>
+              </w:rPr>
+              <w:t xml:space="preserve">Valeur</w:t>
+            </w:r>
+          </w:p>
+        </w:tc>
+      </w:tr>
+      <w:tr>
+        <w:trPr>
+          <w:tblHeader w:val="off"/>
+        </w:trPr>
+        <w:tc>
+          <w:tcPr>
+            <w:shd w:fill="FBE4D5" w:color="auto" w:val="clear"/>
+          </w:tcPr>
+          <w:p>
+            <w:r>
+              <w:rPr>
+                <w:b w:val="false"/>
+                <w:bCs w:val="false"/>
+              </w:rPr>
+              <w:t xml:space="preserve">{#structureRows}{label}</w:t>
+            </w:r>
+          </w:p>
+        </w:tc>
+        <w:tc>
+          <w:p>
+            <w:r>
+              <w:rPr>
+                <w:color w:val="1F4E9A"/>
+              </w:rPr>
+              <w:t xml:space="preserve">{value}{/structureRows}</w:t>
+            </w:r>
+          </w:p>
+        </w:tc>
+      </w:tr>
+    </w:tbl>
+    <w:p>
+      <w:r>
+        <w:t xml:space="preserve">{#stabilityNotes}</w:t>
+      </w:r>
+    </w:p>
+    <w:p>
+      <w:pPr>
+        <w:keepNext/>
+        <w:spacing w:before="200"/>
+      </w:pPr>
+      <w:r>
+        <w:rPr>
+          <w:b/>
+          <w:bCs/>
+        </w:rPr>
+        <w:t xml:space="preserve">{title}</w:t>
+      </w:r>
+    </w:p>
+    <w:p>
+      <w:pPr>
+        <w:keepNext/>
+      </w:pPr>
+      <w:r>
+        <w:t xml:space="preserve">Formule : </w:t>
+      </w:r>
+      <w:r>
+        <w:t xml:space="preserve">{formula}</w:t>
+      </w:r>
+    </w:p>
+    <w:p>
+      <w:pPr>
+        <w:keepNext/>
+      </w:pPr>
+      <w:r>
+        <w:rPr>
+          <w:color w:val="C00000"/>
+          <w:u w:val="single"/>
+        </w:rPr>
+        <w:t xml:space="preserve">Application numérique :</w:t>
+      </w:r>
+      <w:r>
+        <w:t xml:space="preserve"> {application}</w:t>
+      </w:r>
+    </w:p>
+    <w:p>
+      <w:pPr>
+        <w:keepNext w:val="false"/>
+      </w:pPr>
+      <w:r>
+        <w:t xml:space="preserve">Résultat : </w:t>
+      </w:r>
+      <w:r>
+        <w:rPr>
+          <w:color w:val="1F4E9A"/>
+        </w:rPr>
+        <w:t xml:space="preserve">{result}</w:t>
+      </w:r>
+    </w:p>
+    <w:p>
+      <w:r>
+        <w:t xml:space="preserve">{#conclusion}</w:t>
+      </w:r>
+    </w:p>
+    <w:p>
+      <w:r>
+        <w:rPr>
+          <w:color w:val="C00000"/>
+          <w:u w:val="single"/>
+        </w:rPr>
+        <w:t xml:space="preserve">{conclusion}</w:t>
+      </w:r>
+    </w:p>
+    <w:p>
+      <w:r>
+        <w:t xml:space="preserve">{/conclusion}</w:t>
+      </w:r>
+    </w:p>
+    <w:p>
+      <w:r>
+        <w:t xml:space="preserve">{/stabilityNotes}</w:t>
       </w:r>
     </w:p>
     <w:p>

</xml_diff>

<commit_message>
feat(dossier): equipment and documentation tables with annex numbers, full characteristics, compliance summary
Co-Authored-By: Claude Sonnet 5.5 <noreply@anthropic.com>
</commit_message>
<xml_diff>
--- a/packages/docx-template/template/dossier-template.docx
+++ b/packages/docx-template/template/dossier-template.docx
@@ -91,6 +91,255 @@
         <w:t xml:space="preserve">{siteBuildingLine}</w:t>
       </w:r>
     </w:p>
+    <w:p>
+      <w:pPr>
+        <w:pStyle w:val="Heading2"/>
+      </w:pPr>
+      <w:r>
+        <w:t xml:space="preserve">{sectionNumberPresentation}1 Documentation de la solution</w:t>
+      </w:r>
+    </w:p>
+    <w:tbl>
+      <w:tblPr>
+        <w:tblW w:type="pct" w:w="5000"/>
+        <w:tblBorders>
+          <w:top w:val="single" w:color="000000" w:sz="4"/>
+          <w:left w:val="single" w:color="000000" w:sz="4"/>
+          <w:bottom w:val="single" w:color="000000" w:sz="4"/>
+          <w:right w:val="single" w:color="000000" w:sz="4"/>
+          <w:insideH w:val="single" w:color="000000" w:sz="4"/>
+          <w:insideV w:val="single" w:color="000000" w:sz="4"/>
+        </w:tblBorders>
+      </w:tblPr>
+      <w:tblGrid>
+        <w:gridCol w:w="4535"/>
+        <w:gridCol w:w="4535"/>
+      </w:tblGrid>
+      <w:tr>
+        <w:trPr>
+          <w:tblHeader/>
+        </w:trPr>
+        <w:tc>
+          <w:tcPr>
+            <w:shd w:fill="FFC000" w:color="auto" w:val="clear"/>
+          </w:tcPr>
+          <w:p>
+            <w:r>
+              <w:rPr>
+                <w:b/>
+                <w:bCs/>
+              </w:rPr>
+              <w:t xml:space="preserve">Document</w:t>
+            </w:r>
+          </w:p>
+        </w:tc>
+        <w:tc>
+          <w:tcPr>
+            <w:shd w:fill="FFC000" w:color="auto" w:val="clear"/>
+          </w:tcPr>
+          <w:p>
+            <w:r>
+              <w:rPr>
+                <w:b/>
+                <w:bCs/>
+              </w:rPr>
+              <w:t xml:space="preserve">Annexe N°</w:t>
+            </w:r>
+          </w:p>
+        </w:tc>
+      </w:tr>
+      <w:tr>
+        <w:trPr>
+          <w:tblHeader w:val="off"/>
+        </w:trPr>
+        <w:tc>
+          <w:tcPr>
+            <w:shd w:fill="FBE4D5" w:color="auto" w:val="clear"/>
+          </w:tcPr>
+          <w:p>
+            <w:r>
+              <w:rPr>
+                <w:b w:val="false"/>
+                <w:bCs w:val="false"/>
+              </w:rPr>
+              <w:t xml:space="preserve">{#documentationRows}{designation}</w:t>
+            </w:r>
+          </w:p>
+        </w:tc>
+        <w:tc>
+          <w:p>
+            <w:r>
+              <w:rPr>
+                <w:color w:val="1F4E9A"/>
+              </w:rPr>
+              <w:t xml:space="preserve">{annex}{/documentationRows}</w:t>
+            </w:r>
+          </w:p>
+        </w:tc>
+      </w:tr>
+    </w:tbl>
+    <w:p>
+      <w:pPr>
+        <w:pStyle w:val="Heading2"/>
+      </w:pPr>
+      <w:r>
+        <w:t xml:space="preserve">{sectionNumberPresentation}2 Équipements de la solution</w:t>
+      </w:r>
+    </w:p>
+    <w:tbl>
+      <w:tblPr>
+        <w:tblW w:type="pct" w:w="5000"/>
+        <w:tblBorders>
+          <w:top w:val="single" w:color="000000" w:sz="4"/>
+          <w:left w:val="single" w:color="000000" w:sz="4"/>
+          <w:bottom w:val="single" w:color="000000" w:sz="4"/>
+          <w:right w:val="single" w:color="000000" w:sz="4"/>
+          <w:insideH w:val="single" w:color="000000" w:sz="4"/>
+          <w:insideV w:val="single" w:color="000000" w:sz="4"/>
+        </w:tblBorders>
+      </w:tblPr>
+      <w:tblGrid>
+        <w:gridCol w:w="1814"/>
+        <w:gridCol w:w="1814"/>
+        <w:gridCol w:w="1814"/>
+        <w:gridCol w:w="1814"/>
+        <w:gridCol w:w="1814"/>
+      </w:tblGrid>
+      <w:tr>
+        <w:trPr>
+          <w:tblHeader/>
+        </w:trPr>
+        <w:tc>
+          <w:tcPr>
+            <w:shd w:fill="FFC000" w:color="auto" w:val="clear"/>
+          </w:tcPr>
+          <w:p>
+            <w:r>
+              <w:rPr>
+                <w:b/>
+                <w:bCs/>
+              </w:rPr>
+              <w:t xml:space="preserve">Désignation</w:t>
+            </w:r>
+          </w:p>
+        </w:tc>
+        <w:tc>
+          <w:tcPr>
+            <w:shd w:fill="FFC000" w:color="auto" w:val="clear"/>
+          </w:tcPr>
+          <w:p>
+            <w:r>
+              <w:rPr>
+                <w:b/>
+                <w:bCs/>
+              </w:rPr>
+              <w:t xml:space="preserve">Quantité</w:t>
+            </w:r>
+          </w:p>
+        </w:tc>
+        <w:tc>
+          <w:tcPr>
+            <w:shd w:fill="FFC000" w:color="auto" w:val="clear"/>
+          </w:tcPr>
+          <w:p>
+            <w:r>
+              <w:rPr>
+                <w:b/>
+                <w:bCs/>
+              </w:rPr>
+              <w:t xml:space="preserve">Marque</w:t>
+            </w:r>
+          </w:p>
+        </w:tc>
+        <w:tc>
+          <w:tcPr>
+            <w:shd w:fill="FFC000" w:color="auto" w:val="clear"/>
+          </w:tcPr>
+          <w:p>
+            <w:r>
+              <w:rPr>
+                <w:b/>
+                <w:bCs/>
+              </w:rPr>
+              <w:t xml:space="preserve">Référence</w:t>
+            </w:r>
+          </w:p>
+        </w:tc>
+        <w:tc>
+          <w:tcPr>
+            <w:shd w:fill="FFC000" w:color="auto" w:val="clear"/>
+          </w:tcPr>
+          <w:p>
+            <w:r>
+              <w:rPr>
+                <w:b/>
+                <w:bCs/>
+              </w:rPr>
+              <w:t xml:space="preserve">Annexe N°</w:t>
+            </w:r>
+          </w:p>
+        </w:tc>
+      </w:tr>
+      <w:tr>
+        <w:trPr>
+          <w:tblHeader w:val="off"/>
+        </w:trPr>
+        <w:tc>
+          <w:tcPr>
+            <w:shd w:fill="FBE4D5" w:color="auto" w:val="clear"/>
+          </w:tcPr>
+          <w:p>
+            <w:r>
+              <w:rPr>
+                <w:b w:val="false"/>
+                <w:bCs w:val="false"/>
+              </w:rPr>
+              <w:t xml:space="preserve">{#equipmentRows}{designation}</w:t>
+            </w:r>
+          </w:p>
+        </w:tc>
+        <w:tc>
+          <w:p>
+            <w:r>
+              <w:rPr>
+                <w:color w:val="1F4E9A"/>
+              </w:rPr>
+              <w:t xml:space="preserve">{quantity}</w:t>
+            </w:r>
+          </w:p>
+        </w:tc>
+        <w:tc>
+          <w:p>
+            <w:r>
+              <w:rPr>
+                <w:color w:val="1F4E9A"/>
+              </w:rPr>
+              <w:t xml:space="preserve">{brand}</w:t>
+            </w:r>
+          </w:p>
+        </w:tc>
+        <w:tc>
+          <w:p>
+            <w:r>
+              <w:rPr>
+                <w:color w:val="1F4E9A"/>
+              </w:rPr>
+              <w:t xml:space="preserve">{reference}</w:t>
+            </w:r>
+          </w:p>
+        </w:tc>
+        <w:tc>
+          <w:p>
+            <w:r>
+              <w:rPr>
+                <w:color w:val="1F4E9A"/>
+              </w:rPr>
+              <w:t xml:space="preserve">{annex}{/equipmentRows}</w:t>
+            </w:r>
+          </w:p>
+        </w:tc>
+      </w:tr>
+    </w:tbl>
     <w:p>
       <w:pPr>
         <w:pStyle w:val="Heading1"/>
@@ -705,133 +954,17 @@
                 <w:b w:val="false"/>
                 <w:bCs w:val="false"/>
               </w:rPr>
-              <w:t xml:space="preserve">Puissance crête (Wc)</w:t>
-            </w:r>
-          </w:p>
-        </w:tc>
-        <w:tc>
-          <w:p>
-            <w:r>
-              <w:rPr>
-                <w:color w:val="1F4E9A"/>
-              </w:rPr>
-              <w:t xml:space="preserve">{moduleSpecPmaxW}</w:t>
-            </w:r>
-          </w:p>
-        </w:tc>
-      </w:tr>
-      <w:tr>
-        <w:trPr>
-          <w:tblHeader w:val="off"/>
-        </w:trPr>
-        <w:tc>
-          <w:tcPr>
-            <w:shd w:fill="FBE4D5" w:color="auto" w:val="clear"/>
-          </w:tcPr>
-          <w:p>
-            <w:r>
-              <w:rPr>
-                <w:b w:val="false"/>
-                <w:bCs w:val="false"/>
-              </w:rPr>
-              <w:t xml:space="preserve">Tension Vmp (V)</w:t>
-            </w:r>
-          </w:p>
-        </w:tc>
-        <w:tc>
-          <w:p>
-            <w:r>
-              <w:rPr>
-                <w:color w:val="1F4E9A"/>
-              </w:rPr>
-              <w:t xml:space="preserve">{moduleSpecVmpV}</w:t>
-            </w:r>
-          </w:p>
-        </w:tc>
-      </w:tr>
-      <w:tr>
-        <w:trPr>
-          <w:tblHeader w:val="off"/>
-        </w:trPr>
-        <w:tc>
-          <w:tcPr>
-            <w:shd w:fill="FBE4D5" w:color="auto" w:val="clear"/>
-          </w:tcPr>
-          <w:p>
-            <w:r>
-              <w:rPr>
-                <w:b w:val="false"/>
-                <w:bCs w:val="false"/>
-              </w:rPr>
-              <w:t xml:space="preserve">Courant Imp (A)</w:t>
-            </w:r>
-          </w:p>
-        </w:tc>
-        <w:tc>
-          <w:p>
-            <w:r>
-              <w:rPr>
-                <w:color w:val="1F4E9A"/>
-              </w:rPr>
-              <w:t xml:space="preserve">{moduleSpecImpA}</w:t>
-            </w:r>
-          </w:p>
-        </w:tc>
-      </w:tr>
-      <w:tr>
-        <w:trPr>
-          <w:tblHeader w:val="off"/>
-        </w:trPr>
-        <w:tc>
-          <w:tcPr>
-            <w:shd w:fill="FBE4D5" w:color="auto" w:val="clear"/>
-          </w:tcPr>
-          <w:p>
-            <w:r>
-              <w:rPr>
-                <w:b w:val="false"/>
-                <w:bCs w:val="false"/>
-              </w:rPr>
-              <w:t xml:space="preserve">Tension Voc (V)</w:t>
-            </w:r>
-          </w:p>
-        </w:tc>
-        <w:tc>
-          <w:p>
-            <w:r>
-              <w:rPr>
-                <w:color w:val="1F4E9A"/>
-              </w:rPr>
-              <w:t xml:space="preserve">{moduleSpecVocV}</w:t>
-            </w:r>
-          </w:p>
-        </w:tc>
-      </w:tr>
-      <w:tr>
-        <w:trPr>
-          <w:tblHeader w:val="off"/>
-        </w:trPr>
-        <w:tc>
-          <w:tcPr>
-            <w:shd w:fill="FBE4D5" w:color="auto" w:val="clear"/>
-          </w:tcPr>
-          <w:p>
-            <w:r>
-              <w:rPr>
-                <w:b w:val="false"/>
-                <w:bCs w:val="false"/>
-              </w:rPr>
-              <w:t xml:space="preserve">Courant Isc (A)</w:t>
-            </w:r>
-          </w:p>
-        </w:tc>
-        <w:tc>
-          <w:p>
-            <w:r>
-              <w:rPr>
-                <w:color w:val="1F4E9A"/>
-              </w:rPr>
-              <w:t xml:space="preserve">{moduleSpecIscA}</w:t>
+              <w:t xml:space="preserve">{#moduleSpecRows}{label}</w:t>
+            </w:r>
+          </w:p>
+        </w:tc>
+        <w:tc>
+          <w:p>
+            <w:r>
+              <w:rPr>
+                <w:color w:val="1F4E9A"/>
+              </w:rPr>
+              <w:t xml:space="preserve">{value}{/moduleSpecRows}</w:t>
             </w:r>
           </w:p>
         </w:tc>
@@ -848,6 +981,23 @@
     <w:p>
       <w:r>
         <w:t xml:space="preserve">{#inverters}{inverterLabel} : {inverterBrandModel} — {pacW} W{/inverters}</w:t>
+      </w:r>
+    </w:p>
+    <w:p>
+      <w:r>
+        <w:t xml:space="preserve">{#inverterSpecTables}</w:t>
+      </w:r>
+    </w:p>
+    <w:p>
+      <w:pPr>
+        <w:keepNext/>
+      </w:pPr>
+      <w:r>
+        <w:rPr>
+          <w:b/>
+          <w:bCs/>
+        </w:rPr>
+        <w:t xml:space="preserve">{inverterLabel}</w:t>
       </w:r>
     </w:p>
     <w:tbl>
@@ -880,80 +1030,27 @@
                 <w:b w:val="false"/>
                 <w:bCs w:val="false"/>
               </w:rPr>
-              <w:t xml:space="preserve">Tension DC max (V)</w:t>
-            </w:r>
-          </w:p>
-        </w:tc>
-        <w:tc>
-          <w:p>
-            <w:r>
-              <w:rPr>
-                <w:color w:val="1F4E9A"/>
-              </w:rPr>
-              <w:t xml:space="preserve">{inverterSpecVdcMaxV}</w:t>
-            </w:r>
-          </w:p>
-        </w:tc>
-      </w:tr>
-      <w:tr>
-        <w:trPr>
-          <w:tblHeader w:val="off"/>
-        </w:trPr>
-        <w:tc>
-          <w:tcPr>
-            <w:shd w:fill="FBE4D5" w:color="auto" w:val="clear"/>
-          </w:tcPr>
-          <w:p>
-            <w:r>
-              <w:rPr>
-                <w:b w:val="false"/>
-                <w:bCs w:val="false"/>
-              </w:rPr>
-              <w:t xml:space="preserve">Plage MPPT min (V)</w:t>
-            </w:r>
-          </w:p>
-        </w:tc>
-        <w:tc>
-          <w:p>
-            <w:r>
-              <w:rPr>
-                <w:color w:val="1F4E9A"/>
-              </w:rPr>
-              <w:t xml:space="preserve">{inverterSpecMpptMinV}</w:t>
-            </w:r>
-          </w:p>
-        </w:tc>
-      </w:tr>
-      <w:tr>
-        <w:trPr>
-          <w:tblHeader w:val="off"/>
-        </w:trPr>
-        <w:tc>
-          <w:tcPr>
-            <w:shd w:fill="FBE4D5" w:color="auto" w:val="clear"/>
-          </w:tcPr>
-          <w:p>
-            <w:r>
-              <w:rPr>
-                <w:b w:val="false"/>
-                <w:bCs w:val="false"/>
-              </w:rPr>
-              <w:t xml:space="preserve">Plage MPPT max (V)</w:t>
-            </w:r>
-          </w:p>
-        </w:tc>
-        <w:tc>
-          <w:p>
-            <w:r>
-              <w:rPr>
-                <w:color w:val="1F4E9A"/>
-              </w:rPr>
-              <w:t xml:space="preserve">{inverterSpecMpptMaxV}</w:t>
+              <w:t xml:space="preserve">{#rows}{label}</w:t>
+            </w:r>
+          </w:p>
+        </w:tc>
+        <w:tc>
+          <w:p>
+            <w:r>
+              <w:rPr>
+                <w:color w:val="1F4E9A"/>
+              </w:rPr>
+              <w:t xml:space="preserve">{value}{/rows}</w:t>
             </w:r>
           </w:p>
         </w:tc>
       </w:tr>
     </w:tbl>
+    <w:p>
+      <w:r>
+        <w:t xml:space="preserve">{/inverterSpecTables}</w:t>
+      </w:r>
+    </w:p>
     <w:p>
       <w:pPr>
         <w:pStyle w:val="Heading2"/>
@@ -1204,6 +1301,93 @@
         <w:t xml:space="preserve">{/stringSizingNotes}</w:t>
       </w:r>
     </w:p>
+    <w:p>
+      <w:pPr>
+        <w:pStyle w:val="Heading2"/>
+      </w:pPr>
+      <w:r>
+        <w:t xml:space="preserve">{sectionNumberSolution}5 Caractéristiques des équipements DC et AC</w:t>
+      </w:r>
+    </w:p>
+    <w:tbl>
+      <w:tblPr>
+        <w:tblW w:type="pct" w:w="5000"/>
+        <w:tblBorders>
+          <w:top w:val="single" w:color="000000" w:sz="4"/>
+          <w:left w:val="single" w:color="000000" w:sz="4"/>
+          <w:bottom w:val="single" w:color="000000" w:sz="4"/>
+          <w:right w:val="single" w:color="000000" w:sz="4"/>
+          <w:insideH w:val="single" w:color="000000" w:sz="4"/>
+          <w:insideV w:val="single" w:color="000000" w:sz="4"/>
+        </w:tblBorders>
+      </w:tblPr>
+      <w:tblGrid>
+        <w:gridCol w:w="4535"/>
+        <w:gridCol w:w="4535"/>
+      </w:tblGrid>
+      <w:tr>
+        <w:trPr>
+          <w:tblHeader/>
+        </w:trPr>
+        <w:tc>
+          <w:tcPr>
+            <w:shd w:fill="FFC000" w:color="auto" w:val="clear"/>
+          </w:tcPr>
+          <w:p>
+            <w:r>
+              <w:rPr>
+                <w:b/>
+                <w:bCs/>
+              </w:rPr>
+              <w:t xml:space="preserve">Équipement</w:t>
+            </w:r>
+          </w:p>
+        </w:tc>
+        <w:tc>
+          <w:tcPr>
+            <w:shd w:fill="FFC000" w:color="auto" w:val="clear"/>
+          </w:tcPr>
+          <w:p>
+            <w:r>
+              <w:rPr>
+                <w:b/>
+                <w:bCs/>
+              </w:rPr>
+              <w:t xml:space="preserve">Caractéristiques</w:t>
+            </w:r>
+          </w:p>
+        </w:tc>
+      </w:tr>
+      <w:tr>
+        <w:trPr>
+          <w:tblHeader w:val="off"/>
+        </w:trPr>
+        <w:tc>
+          <w:tcPr>
+            <w:shd w:fill="FBE4D5" w:color="auto" w:val="clear"/>
+          </w:tcPr>
+          <w:p>
+            <w:r>
+              <w:rPr>
+                <w:b w:val="false"/>
+                <w:bCs w:val="false"/>
+              </w:rPr>
+              <w:t xml:space="preserve">{#deviceRatingRows}{device}</w:t>
+            </w:r>
+          </w:p>
+        </w:tc>
+        <w:tc>
+          <w:p>
+            <w:r>
+              <w:rPr>
+                <w:color w:val="1F4E9A"/>
+              </w:rPr>
+              <w:t xml:space="preserve">{ratings}{/deviceRatingRows}</w:t>
+            </w:r>
+          </w:p>
+        </w:tc>
+      </w:tr>
+    </w:tbl>
     <w:p>
       <w:pPr>
         <w:pStyle w:val="Heading1"/>
@@ -2625,6 +2809,119 @@
         <w:t xml:space="preserve">{/acIsolatorRequired}</w:t>
       </w:r>
     </w:p>
+    <w:p>
+      <w:pPr>
+        <w:pStyle w:val="Heading1"/>
+      </w:pPr>
+      <w:r>
+        <w:t xml:space="preserve">{sectionNumberCompliance} Vérifications réglementaires</w:t>
+      </w:r>
+    </w:p>
+    <w:tbl>
+      <w:tblPr>
+        <w:tblW w:type="pct" w:w="5000"/>
+        <w:tblBorders>
+          <w:top w:val="single" w:color="000000" w:sz="4"/>
+          <w:left w:val="single" w:color="000000" w:sz="4"/>
+          <w:bottom w:val="single" w:color="000000" w:sz="4"/>
+          <w:right w:val="single" w:color="000000" w:sz="4"/>
+          <w:insideH w:val="single" w:color="000000" w:sz="4"/>
+          <w:insideV w:val="single" w:color="000000" w:sz="4"/>
+        </w:tblBorders>
+      </w:tblPr>
+      <w:tblGrid>
+        <w:gridCol w:w="3023"/>
+        <w:gridCol w:w="3023"/>
+        <w:gridCol w:w="3023"/>
+      </w:tblGrid>
+      <w:tr>
+        <w:trPr>
+          <w:tblHeader/>
+        </w:trPr>
+        <w:tc>
+          <w:tcPr>
+            <w:shd w:fill="FFC000" w:color="auto" w:val="clear"/>
+          </w:tcPr>
+          <w:p>
+            <w:r>
+              <w:rPr>
+                <w:b/>
+                <w:bCs/>
+              </w:rPr>
+              <w:t xml:space="preserve">Réf.</w:t>
+            </w:r>
+          </w:p>
+        </w:tc>
+        <w:tc>
+          <w:tcPr>
+            <w:shd w:fill="FFC000" w:color="auto" w:val="clear"/>
+          </w:tcPr>
+          <w:p>
+            <w:r>
+              <w:rPr>
+                <w:b/>
+                <w:bCs/>
+              </w:rPr>
+              <w:t xml:space="preserve">Vérification</w:t>
+            </w:r>
+          </w:p>
+        </w:tc>
+        <w:tc>
+          <w:tcPr>
+            <w:shd w:fill="FFC000" w:color="auto" w:val="clear"/>
+          </w:tcPr>
+          <w:p>
+            <w:r>
+              <w:rPr>
+                <w:b/>
+                <w:bCs/>
+              </w:rPr>
+              <w:t xml:space="preserve">Résultat</w:t>
+            </w:r>
+          </w:p>
+        </w:tc>
+      </w:tr>
+      <w:tr>
+        <w:trPr>
+          <w:tblHeader w:val="off"/>
+        </w:trPr>
+        <w:tc>
+          <w:tcPr>
+            <w:shd w:fill="FBE4D5" w:color="auto" w:val="clear"/>
+          </w:tcPr>
+          <w:p>
+            <w:r>
+              <w:rPr>
+                <w:b w:val="false"/>
+                <w:bCs w:val="false"/>
+              </w:rPr>
+              <w:t xml:space="preserve">{#complianceRows}{id}</w:t>
+            </w:r>
+          </w:p>
+        </w:tc>
+        <w:tc>
+          <w:p>
+            <w:r>
+              <w:rPr>
+                <w:b w:val="false"/>
+                <w:bCs w:val="false"/>
+              </w:rPr>
+              <w:t xml:space="preserve">{label}</w:t>
+            </w:r>
+          </w:p>
+        </w:tc>
+        <w:tc>
+          <w:p>
+            <w:r>
+              <w:rPr>
+                <w:color w:val="1F4E9A"/>
+              </w:rPr>
+              <w:t xml:space="preserve">{result}{/complianceRows}</w:t>
+            </w:r>
+          </w:p>
+        </w:tc>
+      </w:tr>
+    </w:tbl>
     <w:p>
       <w:pPr>
         <w:pStyle w:val="Heading1"/>

</xml_diff>